<commit_message>
docs(competitors): refresh comparison with the Process Simulator
The Simulator moves Diagramatix into the simulation category (was marked "no
simulation"). Updated the Signavio/ARIS/PRIME comparison: new §6.1 Simulation —
detailed (engine, shared pools, as-is/to-be cost verdict, live "fork the
timeline" Operator, BPSim interop, vs the suites — with an honest note that ARIS
retains a deeper/mature engine + calendars and that process mining stays
suite-only). Exec summary, "where Diagramatix wins", competitor wins, and
positioning updated; schema v1.25; date June 2026. Regenerated the .docx.

Co-Authored-By: Claude Opus 4.8 <noreply@anthropic.com>
</commit_message>
<xml_diff>
--- a/competitors/diagramatix-vs-signavio-aris-primebpm.docx
+++ b/competitors/diagramatix-vs-signavio-aris-primebpm.docx
@@ -2,7 +2,7 @@
 <file path=word/document.xml><?xml version="1.0" encoding="utf-8"?>
 <w:document xmlns:w="http://schemas.openxmlformats.org/wordprocessingml/2006/main" xmlns:m="http://schemas.openxmlformats.org/officeDocument/2006/math" xmlns:r="http://schemas.openxmlformats.org/officeDocument/2006/relationships" xmlns:o="urn:schemas-microsoft-com:office:office" xmlns:v="urn:schemas-microsoft-com:vml" xmlns:w10="urn:schemas-microsoft-com:office:word" xmlns:a="http://schemas.openxmlformats.org/drawingml/2006/main" xmlns:pic="http://schemas.openxmlformats.org/drawingml/2006/picture" xmlns:wp="http://schemas.openxmlformats.org/drawingml/2006/wordprocessingDrawing">
   <w:body>
-    <w:bookmarkStart w:id="32" w:name="X54516f23b9977d0e2663477a5b0dd0326d83384"/>
+    <w:bookmarkStart w:id="33" w:name="X54516f23b9977d0e2663477a5b0dd0326d83384"/>
     <w:p>
       <w:pPr>
         <w:pStyle w:val="Heading1"/>
@@ -20,7 +20,30 @@
           <w:i/>
           <w:iCs/>
         </w:rPr>
-        <w:t xml:space="preserve">Compiled: May 2026. Diagramatix data from the current codebase (export schema v1.15; BPMN + 6 other diagram types + Collaboration &amp; Review). Competitor data from public product pages and documentation accessed May 2026 — see Sources. Competitor AI features in particular are evolving rapidly; verify against the live product pages before quoting externally.</w:t>
+        <w:t xml:space="preserve">Compiled: June 2026. Diagramatix data from the current codebase (export schema v1.25; BPMN + 6 other diagram types + Collaboration &amp; Review + a built-in discrete-event</w:t>
+      </w:r>
+      <w:r>
+        <w:rPr>
+          <w:i/>
+          <w:iCs/>
+        </w:rPr>
+        <w:t xml:space="preserve"> </w:t>
+      </w:r>
+      <w:r>
+        <w:rPr>
+          <w:b/>
+          <w:bCs/>
+          <w:i/>
+          <w:iCs/>
+        </w:rPr>
+        <w:t xml:space="preserve">Process Simulator</w:t>
+      </w:r>
+      <w:r>
+        <w:rPr>
+          <w:i/>
+          <w:iCs/>
+        </w:rPr>
+        <w:t xml:space="preserve">). Competitor data from public product pages and documentation accessed May–June 2026 — see Sources. Competitor AI and simulation features in particular are evolving rapidly; verify against the live product pages before quoting externally.</w:t>
       </w:r>
     </w:p>
     <w:p>
@@ -181,7 +204,7 @@
               <w:t xml:space="preserve"> </w:t>
             </w:r>
             <w:r>
-              <w:t xml:space="preserve">lay it out), admin-tunable AI rules, and a built-in</w:t>
+              <w:t xml:space="preserve">lay it out), admin-tunable AI rules, a built-in</w:t>
             </w:r>
             <w:r>
               <w:t xml:space="preserve"> </w:t>
@@ -197,7 +220,48 @@
               <w:t xml:space="preserve"> </w:t>
             </w:r>
             <w:r>
-              <w:t xml:space="preserve">workflow.</w:t>
+              <w:t xml:space="preserve">workflow, and a built-in</w:t>
+            </w:r>
+            <w:r>
+              <w:t xml:space="preserve"> </w:t>
+            </w:r>
+            <w:r>
+              <w:rPr>
+                <w:b/>
+                <w:bCs/>
+              </w:rPr>
+              <w:t xml:space="preserve">discrete-event Process Simulator</w:t>
+            </w:r>
+            <w:r>
+              <w:t xml:space="preserve"> </w:t>
+            </w:r>
+            <w:r>
+              <w:t xml:space="preserve">(capacity planning,</w:t>
+            </w:r>
+            <w:r>
+              <w:t xml:space="preserve"> </w:t>
+            </w:r>
+            <w:r>
+              <w:rPr>
+                <w:b/>
+                <w:bCs/>
+              </w:rPr>
+              <w:t xml:space="preserve">as-is vs to-be cost comparison</w:t>
+            </w:r>
+            <w:r>
+              <w:t xml:space="preserve">, live</w:t>
+            </w:r>
+            <w:r>
+              <w:t xml:space="preserve"> </w:t>
+            </w:r>
+            <w:r>
+              <w:t xml:space="preserve">“fork-the-timeline”</w:t>
+            </w:r>
+            <w:r>
+              <w:t xml:space="preserve"> </w:t>
+            </w:r>
+            <w:r>
+              <w:t xml:space="preserve">Operator interventions, BPSim-aligned).</w:t>
             </w:r>
           </w:p>
         </w:tc>
@@ -446,7 +510,67 @@
         <w:t xml:space="preserve"> </w:t>
       </w:r>
       <w:r>
-        <w:t xml:space="preserve">experience, where its editable-plan + rules-governed deterministic layout is genuinely distinctive. The three enterprise suites each win decisively on what surrounds modelling — Signavio on the SAP ecosystem + mining, ARIS on EA breadth + EPC + repository governance, PRIME BPM on built-in process-improvement analytics. None of the three is self-hostable per-seat the way Diagramatix is.</w:t>
+        <w:t xml:space="preserve">experience, where its editable-plan + rules-governed deterministic layout is genuinely distinctive.</w:t>
+      </w:r>
+      <w:r>
+        <w:t xml:space="preserve"> </w:t>
+      </w:r>
+      <w:r>
+        <w:rPr>
+          <w:b/>
+          <w:bCs/>
+        </w:rPr>
+        <w:t xml:space="preserve">New since the last edition: a built-in discrete-event Simulator</w:t>
+      </w:r>
+      <w:r>
+        <w:t xml:space="preserve"> </w:t>
+      </w:r>
+      <w:r>
+        <w:t xml:space="preserve">moves Diagramatix into a category — process simulation, with as-is/to-be cost cases — that was previously the enterprise suites’ alone, and adds touches they don’t combine (a live, interactive</w:t>
+      </w:r>
+      <w:r>
+        <w:t xml:space="preserve"> </w:t>
+      </w:r>
+      <w:r>
+        <w:t xml:space="preserve">“fork-the-timeline”</w:t>
+      </w:r>
+      <w:r>
+        <w:t xml:space="preserve"> </w:t>
+      </w:r>
+      <w:r>
+        <w:t xml:space="preserve">Operator, a plain-language cost/FTE verdict, BPSim import/export, all self-hosted). The three enterprise suites still each win on what</w:t>
+      </w:r>
+      <w:r>
+        <w:t xml:space="preserve"> </w:t>
+      </w:r>
+      <w:r>
+        <w:rPr>
+          <w:i/>
+          <w:iCs/>
+        </w:rPr>
+        <w:t xml:space="preserve">surrounds</w:t>
+      </w:r>
+      <w:r>
+        <w:t xml:space="preserve"> </w:t>
+      </w:r>
+      <w:r>
+        <w:t xml:space="preserve">modelling — Signavio on the SAP ecosystem + mining, ARIS on EA breadth + EPC + repository governance + a deeper, more mature simulation engine, PRIME BPM on built-in process-improvement analytics. None of the three is self-hostable per-seat the way Diagramatix is. Process</w:t>
+      </w:r>
+      <w:r>
+        <w:t xml:space="preserve"> </w:t>
+      </w:r>
+      <w:r>
+        <w:rPr>
+          <w:b/>
+          <w:bCs/>
+        </w:rPr>
+        <w:t xml:space="preserve">mining</w:t>
+      </w:r>
+      <w:r>
+        <w:t xml:space="preserve"> </w:t>
+      </w:r>
+      <w:r>
+        <w:t xml:space="preserve">(real event-log discovery) remains a suite-only capability.</w:t>
       </w:r>
     </w:p>
     <w:p>
@@ -3744,7 +3868,7 @@
       </w:r>
     </w:p>
     <w:bookmarkEnd w:id="15"/>
-    <w:bookmarkStart w:id="16" w:name="process-mining-simulation-execution"/>
+    <w:bookmarkStart w:id="17" w:name="process-mining-simulation-execution"/>
     <w:p>
       <w:pPr>
         <w:pStyle w:val="Heading2"/>
@@ -3835,7 +3959,23 @@
               <w:pStyle w:val="Compact"/>
             </w:pPr>
             <w:r>
-              <w:t xml:space="preserve">Process mining (event-log discovery / conformance)</w:t>
+              <w:t xml:space="preserve">Process</w:t>
+            </w:r>
+            <w:r>
+              <w:t xml:space="preserve"> </w:t>
+            </w:r>
+            <w:r>
+              <w:rPr>
+                <w:b/>
+                <w:bCs/>
+              </w:rPr>
+              <w:t xml:space="preserve">mining</w:t>
+            </w:r>
+            <w:r>
+              <w:t xml:space="preserve"> </w:t>
+            </w:r>
+            <w:r>
+              <w:t xml:space="preserve">(event-log discovery / conformance)</w:t>
             </w:r>
           </w:p>
         </w:tc>
@@ -3892,18 +4032,17 @@
               <w:pStyle w:val="Compact"/>
             </w:pPr>
             <w:r>
-              <w:t xml:space="preserve">Simulation (token-flow / scenario)</w:t>
-            </w:r>
-          </w:p>
-        </w:tc>
-        <w:tc>
-          <w:tcPr/>
-          <w:p>
-            <w:pPr>
-              <w:pStyle w:val="Compact"/>
-            </w:pPr>
-            <w:r>
-              <w:t xml:space="preserve">❌</w:t>
+              <w:t xml:space="preserve">Discrete-event</w:t>
+            </w:r>
+            <w:r>
+              <w:t xml:space="preserve"> </w:t>
+            </w:r>
+            <w:r>
+              <w:rPr>
+                <w:b/>
+                <w:bCs/>
+              </w:rPr>
+              <w:t xml:space="preserve">simulation</w:t>
             </w:r>
           </w:p>
         </w:tc>
@@ -3916,6 +4055,16 @@
             <w:r>
               <w:t xml:space="preserve">✅</w:t>
             </w:r>
+            <w:r>
+              <w:t xml:space="preserve"> </w:t>
+            </w:r>
+            <w:r>
+              <w:rPr>
+                <w:b/>
+                <w:bCs/>
+              </w:rPr>
+              <w:t xml:space="preserve">Built-in DES engine — see §6.1</w:t>
+            </w:r>
           </w:p>
         </w:tc>
         <w:tc>
@@ -3936,7 +4085,18 @@
               <w:pStyle w:val="Compact"/>
             </w:pPr>
             <w:r>
-              <w:t xml:space="preserve">✅ (improvement scenarios, future-state)</w:t>
+              <w:t xml:space="preserve">✅ (mature, animated)</w:t>
+            </w:r>
+          </w:p>
+        </w:tc>
+        <w:tc>
+          <w:tcPr/>
+          <w:p>
+            <w:pPr>
+              <w:pStyle w:val="Compact"/>
+            </w:pPr>
+            <w:r>
+              <w:t xml:space="preserve">✅ (future-state / improvement scenarios)</w:t>
             </w:r>
           </w:p>
         </w:tc>
@@ -3949,40 +4109,56 @@
               <w:pStyle w:val="Compact"/>
             </w:pPr>
             <w:r>
-              <w:t xml:space="preserve">Built-in process-improvement analytics (cycle time, cost, VA/NVA)</w:t>
-            </w:r>
-          </w:p>
-        </w:tc>
-        <w:tc>
-          <w:tcPr/>
-          <w:p>
-            <w:pPr>
-              <w:pStyle w:val="Compact"/>
-            </w:pPr>
-            <w:r>
-              <w:t xml:space="preserve">✅ Value Analysis badges + bottleneck overlay (manual mark-up)</w:t>
-            </w:r>
-          </w:p>
-        </w:tc>
-        <w:tc>
-          <w:tcPr/>
-          <w:p>
-            <w:pPr>
-              <w:pStyle w:val="Compact"/>
-            </w:pPr>
-            <w:r>
-              <w:t xml:space="preserve">Via mining KPIs</w:t>
-            </w:r>
-          </w:p>
-        </w:tc>
-        <w:tc>
-          <w:tcPr/>
-          <w:p>
-            <w:pPr>
-              <w:pStyle w:val="Compact"/>
-            </w:pPr>
-            <w:r>
-              <w:t xml:space="preserve">Via mining KPIs</w:t>
+              <w:t xml:space="preserve">Cost &amp; capacity analysis (cycle time, cost, VA/NVA)</w:t>
+            </w:r>
+          </w:p>
+        </w:tc>
+        <w:tc>
+          <w:tcPr/>
+          <w:p>
+            <w:pPr>
+              <w:pStyle w:val="Compact"/>
+            </w:pPr>
+            <w:r>
+              <w:t xml:space="preserve">✅</w:t>
+            </w:r>
+            <w:r>
+              <w:t xml:space="preserve"> </w:t>
+            </w:r>
+            <w:r>
+              <w:rPr>
+                <w:b/>
+                <w:bCs/>
+              </w:rPr>
+              <w:t xml:space="preserve">Cost-per-case, total cost, utilisation, bottleneck ranking — quantified by the simulator</w:t>
+            </w:r>
+            <w:r>
+              <w:t xml:space="preserve"> </w:t>
+            </w:r>
+            <w:r>
+              <w:t xml:space="preserve">(+ Value Analysis badges)</w:t>
+            </w:r>
+          </w:p>
+        </w:tc>
+        <w:tc>
+          <w:tcPr/>
+          <w:p>
+            <w:pPr>
+              <w:pStyle w:val="Compact"/>
+            </w:pPr>
+            <w:r>
+              <w:t xml:space="preserve">Via mining KPIs / simulation</w:t>
+            </w:r>
+          </w:p>
+        </w:tc>
+        <w:tc>
+          <w:tcPr/>
+          <w:p>
+            <w:pPr>
+              <w:pStyle w:val="Compact"/>
+            </w:pPr>
+            <w:r>
+              <w:t xml:space="preserve">Via simulation / mining KPIs</w:t>
             </w:r>
           </w:p>
         </w:tc>
@@ -4087,24 +4263,107 @@
         <w:t xml:space="preserve"> </w:t>
       </w:r>
       <w:r>
-        <w:t xml:space="preserve">This is where the suites are in a different category. Diagramatix is design-time only and relies on the modeller to mark up value/bottlenecks; Signavio and ARIS discover the real process from logs; PRIME BPM’s Improver edition turns analysis into quantified improvement cases.</w:t>
+        <w:t xml:space="preserve">Process</w:t>
+      </w:r>
+      <w:r>
+        <w:t xml:space="preserve"> </w:t>
+      </w:r>
+      <w:r>
+        <w:rPr>
+          <w:b/>
+          <w:bCs/>
+        </w:rPr>
+        <w:t xml:space="preserve">mining</w:t>
+      </w:r>
+      <w:r>
+        <w:t xml:space="preserve"> </w:t>
+      </w:r>
+      <w:r>
+        <w:t xml:space="preserve">(discovering the real process from system logs) is still suite-only — Signavio and ARIS lead, and Diagramatix doesn’t compete there. But</w:t>
+      </w:r>
+      <w:r>
+        <w:t xml:space="preserve"> </w:t>
+      </w:r>
+      <w:r>
+        <w:rPr>
+          <w:b/>
+          <w:bCs/>
+        </w:rPr>
+        <w:t xml:space="preserve">simulation is no longer a gap</w:t>
+      </w:r>
+      <w:r>
+        <w:t xml:space="preserve">: Diagramatix now ships a full discrete-event engine that quantifies cost, capacity and the case for a redesign (§6.1). ARIS retains the deepest, most mature simulation (animation, advanced resource/calendar models); Diagramatix’s edge is</w:t>
+      </w:r>
+      <w:r>
+        <w:t xml:space="preserve"> </w:t>
+      </w:r>
+      <w:r>
+        <w:rPr>
+          <w:i/>
+          <w:iCs/>
+        </w:rPr>
+        <w:t xml:space="preserve">accessibility + distinctive touches</w:t>
+      </w:r>
+      <w:r>
+        <w:t xml:space="preserve"> </w:t>
+      </w:r>
+      <w:r>
+        <w:t xml:space="preserve">in the same tool you author and AI-generate in.</w:t>
+      </w:r>
+    </w:p>
+    <w:bookmarkStart w:id="16" w:name="simulation-detailed"/>
+    <w:p>
+      <w:pPr>
+        <w:pStyle w:val="Heading3"/>
+      </w:pPr>
+      <w:r>
+        <w:t xml:space="preserve">6.1 Simulation — detailed</w:t>
       </w:r>
     </w:p>
     <w:p>
-      <w:r>
-        <w:pict>
-          <v:rect style="width:0;height:1.5pt" o:hralign="center" o:hrstd="t" o:hr="t"/>
-        </w:pict>
-      </w:r>
-    </w:p>
-    <w:bookmarkEnd w:id="16"/>
-    <w:bookmarkStart w:id="17" w:name="export-interop-deployment"/>
-    <w:p>
-      <w:pPr>
-        <w:pStyle w:val="Heading2"/>
-      </w:pPr>
-      <w:r>
-        <w:t xml:space="preserve">7. Export, interop &amp; deployment</w:t>
+      <w:pPr>
+        <w:pStyle w:val="FirstParagraph"/>
+      </w:pPr>
+      <w:r>
+        <w:t xml:space="preserve">Diagramatix has moved from</w:t>
+      </w:r>
+      <w:r>
+        <w:t xml:space="preserve"> </w:t>
+      </w:r>
+      <w:r>
+        <w:t xml:space="preserve">“design-time only”</w:t>
+      </w:r>
+      <w:r>
+        <w:t xml:space="preserve"> </w:t>
+      </w:r>
+      <w:r>
+        <w:t xml:space="preserve">to a</w:t>
+      </w:r>
+      <w:r>
+        <w:t xml:space="preserve"> </w:t>
+      </w:r>
+      <w:r>
+        <w:rPr>
+          <w:b/>
+          <w:bCs/>
+        </w:rPr>
+        <w:t xml:space="preserve">built-in event-based (discrete-event) Process Simulator</w:t>
+      </w:r>
+      <w:r>
+        <w:t xml:space="preserve">: work items flow over a simulated clock, tasks seize limited team capacity so realistic queues and wait times</w:t>
+      </w:r>
+      <w:r>
+        <w:t xml:space="preserve"> </w:t>
+      </w:r>
+      <w:r>
+        <w:rPr>
+          <w:i/>
+          <w:iCs/>
+        </w:rPr>
+        <w:t xml:space="preserve">emerge from contention</w:t>
+      </w:r>
+      <w:r>
+        <w:t xml:space="preserve">, and Monte-Carlo replications give ranges (mean / p50 / p95), not a single misleading number. It runs in the same tool, with no separate enterprise module.</w:t>
       </w:r>
     </w:p>
     <w:tbl>
@@ -4132,6 +4391,1143 @@
               <w:pStyle w:val="Compact"/>
             </w:pPr>
             <w:r>
+              <w:t xml:space="preserve">Simulation capability</w:t>
+            </w:r>
+          </w:p>
+        </w:tc>
+        <w:tc>
+          <w:tcPr/>
+          <w:p>
+            <w:pPr>
+              <w:pStyle w:val="Compact"/>
+            </w:pPr>
+            <w:r>
+              <w:rPr>
+                <w:b/>
+                <w:bCs/>
+              </w:rPr>
+              <w:t xml:space="preserve">Diagramatix</w:t>
+            </w:r>
+          </w:p>
+        </w:tc>
+        <w:tc>
+          <w:tcPr/>
+          <w:p>
+            <w:pPr>
+              <w:pStyle w:val="Compact"/>
+            </w:pPr>
+            <w:r>
+              <w:rPr>
+                <w:b/>
+                <w:bCs/>
+              </w:rPr>
+              <w:t xml:space="preserve">Signavio</w:t>
+            </w:r>
+          </w:p>
+        </w:tc>
+        <w:tc>
+          <w:tcPr/>
+          <w:p>
+            <w:pPr>
+              <w:pStyle w:val="Compact"/>
+            </w:pPr>
+            <w:r>
+              <w:rPr>
+                <w:b/>
+                <w:bCs/>
+              </w:rPr>
+              <w:t xml:space="preserve">ARIS</w:t>
+            </w:r>
+          </w:p>
+        </w:tc>
+        <w:tc>
+          <w:tcPr/>
+          <w:p>
+            <w:pPr>
+              <w:pStyle w:val="Compact"/>
+            </w:pPr>
+            <w:r>
+              <w:rPr>
+                <w:b/>
+                <w:bCs/>
+              </w:rPr>
+              <w:t xml:space="preserve">PRIME BPM</w:t>
+            </w:r>
+          </w:p>
+        </w:tc>
+      </w:tr>
+      <w:tr>
+        <w:tc>
+          <w:tcPr/>
+          <w:p>
+            <w:pPr>
+              <w:pStyle w:val="Compact"/>
+            </w:pPr>
+            <w:r>
+              <w:t xml:space="preserve">Engine</w:t>
+            </w:r>
+          </w:p>
+        </w:tc>
+        <w:tc>
+          <w:tcPr/>
+          <w:p>
+            <w:pPr>
+              <w:pStyle w:val="Compact"/>
+            </w:pPr>
+            <w:r>
+              <w:t xml:space="preserve">Discrete-event, token-flow, resource contention; Monte-Carlo ranges (p5/p50/p95)</w:t>
+            </w:r>
+          </w:p>
+        </w:tc>
+        <w:tc>
+          <w:tcPr/>
+          <w:p>
+            <w:pPr>
+              <w:pStyle w:val="Compact"/>
+            </w:pPr>
+            <w:r>
+              <w:t xml:space="preserve">Token-based</w:t>
+            </w:r>
+          </w:p>
+        </w:tc>
+        <w:tc>
+          <w:tcPr/>
+          <w:p>
+            <w:pPr>
+              <w:pStyle w:val="Compact"/>
+            </w:pPr>
+            <w:r>
+              <w:t xml:space="preserve">Discrete-event (mature, animated)</w:t>
+            </w:r>
+          </w:p>
+        </w:tc>
+        <w:tc>
+          <w:tcPr/>
+          <w:p>
+            <w:pPr>
+              <w:pStyle w:val="Compact"/>
+            </w:pPr>
+            <w:r>
+              <w:t xml:space="preserve">Scenario / future-state analysis</w:t>
+            </w:r>
+          </w:p>
+        </w:tc>
+      </w:tr>
+      <w:tr>
+        <w:tc>
+          <w:tcPr/>
+          <w:p>
+            <w:pPr>
+              <w:pStyle w:val="Compact"/>
+            </w:pPr>
+            <w:r>
+              <w:t xml:space="preserve">Shared resource pools across</w:t>
+            </w:r>
+            <w:r>
+              <w:t xml:space="preserve"> </w:t>
+            </w:r>
+            <w:r>
+              <w:rPr>
+                <w:i/>
+                <w:iCs/>
+              </w:rPr>
+              <w:t xml:space="preserve">multiple</w:t>
+            </w:r>
+            <w:r>
+              <w:t xml:space="preserve"> </w:t>
+            </w:r>
+            <w:r>
+              <w:t xml:space="preserve">processes (portfolio)</w:t>
+            </w:r>
+          </w:p>
+        </w:tc>
+        <w:tc>
+          <w:tcPr/>
+          <w:p>
+            <w:pPr>
+              <w:pStyle w:val="Compact"/>
+            </w:pPr>
+            <w:r>
+              <w:t xml:space="preserve">✅ One team pool shared across diagrams → genuine cross-process capacity planning</w:t>
+            </w:r>
+          </w:p>
+        </w:tc>
+        <w:tc>
+          <w:tcPr/>
+          <w:p>
+            <w:pPr>
+              <w:pStyle w:val="Compact"/>
+            </w:pPr>
+            <w:r>
+              <w:t xml:space="preserve">Partial</w:t>
+            </w:r>
+          </w:p>
+        </w:tc>
+        <w:tc>
+          <w:tcPr/>
+          <w:p>
+            <w:pPr>
+              <w:pStyle w:val="Compact"/>
+            </w:pPr>
+            <w:r>
+              <w:t xml:space="preserve">✅</w:t>
+            </w:r>
+          </w:p>
+        </w:tc>
+        <w:tc>
+          <w:tcPr/>
+          <w:p>
+            <w:pPr>
+              <w:pStyle w:val="Compact"/>
+            </w:pPr>
+            <w:r>
+              <w:t xml:space="preserve">—</w:t>
+            </w:r>
+          </w:p>
+        </w:tc>
+      </w:tr>
+      <w:tr>
+        <w:tc>
+          <w:tcPr/>
+          <w:p>
+            <w:pPr>
+              <w:pStyle w:val="Compact"/>
+            </w:pPr>
+            <w:r>
+              <w:rPr>
+                <w:b/>
+                <w:bCs/>
+              </w:rPr>
+              <w:t xml:space="preserve">As-is vs To-be</w:t>
+            </w:r>
+            <w:r>
+              <w:t xml:space="preserve"> </w:t>
+            </w:r>
+            <w:r>
+              <w:t xml:space="preserve">comparison with a cost</w:t>
+            </w:r>
+            <w:r>
+              <w:t xml:space="preserve"> </w:t>
+            </w:r>
+            <w:r>
+              <w:rPr>
+                <w:b/>
+                <w:bCs/>
+              </w:rPr>
+              <w:t xml:space="preserve">verdict</w:t>
+            </w:r>
+          </w:p>
+        </w:tc>
+        <w:tc>
+          <w:tcPr/>
+          <w:p>
+            <w:pPr>
+              <w:pStyle w:val="Compact"/>
+            </w:pPr>
+            <w:r>
+              <w:t xml:space="preserve">✅</w:t>
+            </w:r>
+            <w:r>
+              <w:t xml:space="preserve"> </w:t>
+            </w:r>
+            <w:r>
+              <w:rPr>
+                <w:b/>
+                <w:bCs/>
+              </w:rPr>
+              <w:t xml:space="preserve">Pin scenarios to different process variants; plain-language verdict</w:t>
+            </w:r>
+            <w:r>
+              <w:t xml:space="preserve"> </w:t>
+            </w:r>
+            <w:r>
+              <w:t xml:space="preserve">(e.g. </w:t>
+            </w:r>
+            <w:r>
+              <w:t xml:space="preserve">“28% faster, +12% throughput, $4.2k less per case, frees ~1.4 FTE”</w:t>
+            </w:r>
+            <w:r>
+              <w:t xml:space="preserve">)</w:t>
+            </w:r>
+          </w:p>
+        </w:tc>
+        <w:tc>
+          <w:tcPr/>
+          <w:p>
+            <w:pPr>
+              <w:pStyle w:val="Compact"/>
+            </w:pPr>
+            <w:r>
+              <w:t xml:space="preserve">Via scenarios</w:t>
+            </w:r>
+          </w:p>
+        </w:tc>
+        <w:tc>
+          <w:tcPr/>
+          <w:p>
+            <w:pPr>
+              <w:pStyle w:val="Compact"/>
+            </w:pPr>
+            <w:r>
+              <w:t xml:space="preserve">Via scenarios</w:t>
+            </w:r>
+          </w:p>
+        </w:tc>
+        <w:tc>
+          <w:tcPr/>
+          <w:p>
+            <w:pPr>
+              <w:pStyle w:val="Compact"/>
+            </w:pPr>
+            <w:r>
+              <w:t xml:space="preserve">✅ future-state cost/time</w:t>
+            </w:r>
+          </w:p>
+        </w:tc>
+      </w:tr>
+      <w:tr>
+        <w:tc>
+          <w:tcPr/>
+          <w:p>
+            <w:pPr>
+              <w:pStyle w:val="Compact"/>
+            </w:pPr>
+            <w:r>
+              <w:t xml:space="preserve">Cost modelling (cost/hour → cost-per-case, total cost, savings)</w:t>
+            </w:r>
+          </w:p>
+        </w:tc>
+        <w:tc>
+          <w:tcPr/>
+          <w:p>
+            <w:pPr>
+              <w:pStyle w:val="Compact"/>
+            </w:pPr>
+            <w:r>
+              <w:t xml:space="preserve">✅</w:t>
+            </w:r>
+          </w:p>
+        </w:tc>
+        <w:tc>
+          <w:tcPr/>
+          <w:p>
+            <w:pPr>
+              <w:pStyle w:val="Compact"/>
+            </w:pPr>
+            <w:r>
+              <w:t xml:space="preserve">✅</w:t>
+            </w:r>
+          </w:p>
+        </w:tc>
+        <w:tc>
+          <w:tcPr/>
+          <w:p>
+            <w:pPr>
+              <w:pStyle w:val="Compact"/>
+            </w:pPr>
+            <w:r>
+              <w:t xml:space="preserve">✅</w:t>
+            </w:r>
+          </w:p>
+        </w:tc>
+        <w:tc>
+          <w:tcPr/>
+          <w:p>
+            <w:pPr>
+              <w:pStyle w:val="Compact"/>
+            </w:pPr>
+            <w:r>
+              <w:t xml:space="preserve">✅</w:t>
+            </w:r>
+          </w:p>
+        </w:tc>
+      </w:tr>
+      <w:tr>
+        <w:tc>
+          <w:tcPr/>
+          <w:p>
+            <w:pPr>
+              <w:pStyle w:val="Compact"/>
+            </w:pPr>
+            <w:r>
+              <w:rPr>
+                <w:b/>
+                <w:bCs/>
+              </w:rPr>
+              <w:t xml:space="preserve">Live, interactive replay with mid-run intervention</w:t>
+            </w:r>
+          </w:p>
+        </w:tc>
+        <w:tc>
+          <w:tcPr/>
+          <w:p>
+            <w:pPr>
+              <w:pStyle w:val="Compact"/>
+            </w:pPr>
+            <w:r>
+              <w:t xml:space="preserve">✅</w:t>
+            </w:r>
+            <w:r>
+              <w:t xml:space="preserve"> </w:t>
+            </w:r>
+            <w:r>
+              <w:rPr>
+                <w:b/>
+                <w:bCs/>
+              </w:rPr>
+              <w:t xml:space="preserve">“Fork the timeline”</w:t>
+            </w:r>
+            <w:r>
+              <w:rPr>
+                <w:b/>
+                <w:bCs/>
+              </w:rPr>
+              <w:t xml:space="preserve"> </w:t>
+            </w:r>
+            <w:r>
+              <w:rPr>
+                <w:b/>
+                <w:bCs/>
+              </w:rPr>
+              <w:t xml:space="preserve">Operator</w:t>
+            </w:r>
+            <w:r>
+              <w:t xml:space="preserve"> </w:t>
+            </w:r>
+            <w:r>
+              <w:t xml:space="preserve">— add capacity / inject a surge</w:t>
+            </w:r>
+            <w:r>
+              <w:t xml:space="preserve"> </w:t>
+            </w:r>
+            <w:r>
+              <w:rPr>
+                <w:i/>
+                <w:iCs/>
+              </w:rPr>
+              <w:t xml:space="preserve">mid-run</w:t>
+            </w:r>
+            <w:r>
+              <w:t xml:space="preserve"> </w:t>
+            </w:r>
+            <w:r>
+              <w:t xml:space="preserve">and re-run deterministically; animated token replay + utilisation heatmap</w:t>
+            </w:r>
+          </w:p>
+        </w:tc>
+        <w:tc>
+          <w:tcPr/>
+          <w:p>
+            <w:pPr>
+              <w:pStyle w:val="Compact"/>
+            </w:pPr>
+            <w:r>
+              <w:t xml:space="preserve">—</w:t>
+            </w:r>
+          </w:p>
+        </w:tc>
+        <w:tc>
+          <w:tcPr/>
+          <w:p>
+            <w:pPr>
+              <w:pStyle w:val="Compact"/>
+            </w:pPr>
+            <w:r>
+              <w:t xml:space="preserve">✅ animation (not an interactive fork)</w:t>
+            </w:r>
+          </w:p>
+        </w:tc>
+        <w:tc>
+          <w:tcPr/>
+          <w:p>
+            <w:pPr>
+              <w:pStyle w:val="Compact"/>
+            </w:pPr>
+            <w:r>
+              <w:t xml:space="preserve">—</w:t>
+            </w:r>
+          </w:p>
+        </w:tc>
+      </w:tr>
+      <w:tr>
+        <w:tc>
+          <w:tcPr/>
+          <w:p>
+            <w:pPr>
+              <w:pStyle w:val="Compact"/>
+            </w:pPr>
+            <w:r>
+              <w:t xml:space="preserve">Subprocess roll-up incl. </w:t>
+            </w:r>
+            <w:r>
+              <w:rPr>
+                <w:b/>
+                <w:bCs/>
+              </w:rPr>
+              <w:t xml:space="preserve">linked diagrams</w:t>
+            </w:r>
+          </w:p>
+        </w:tc>
+        <w:tc>
+          <w:tcPr/>
+          <w:p>
+            <w:pPr>
+              <w:pStyle w:val="Compact"/>
+            </w:pPr>
+            <w:r>
+              <w:t xml:space="preserve">✅ inline</w:t>
+            </w:r>
+            <w:r>
+              <w:t xml:space="preserve"> </w:t>
+            </w:r>
+            <w:r>
+              <w:rPr>
+                <w:i/>
+                <w:iCs/>
+              </w:rPr>
+              <w:t xml:space="preserve">and</w:t>
+            </w:r>
+            <w:r>
+              <w:t xml:space="preserve"> </w:t>
+            </w:r>
+            <w:r>
+              <w:t xml:space="preserve">linked drill-down (nested + parallel instances isolated)</w:t>
+            </w:r>
+          </w:p>
+        </w:tc>
+        <w:tc>
+          <w:tcPr/>
+          <w:p>
+            <w:pPr>
+              <w:pStyle w:val="Compact"/>
+            </w:pPr>
+            <w:r>
+              <w:t xml:space="preserve">✅</w:t>
+            </w:r>
+          </w:p>
+        </w:tc>
+        <w:tc>
+          <w:tcPr/>
+          <w:p>
+            <w:pPr>
+              <w:pStyle w:val="Compact"/>
+            </w:pPr>
+            <w:r>
+              <w:t xml:space="preserve">✅</w:t>
+            </w:r>
+          </w:p>
+        </w:tc>
+        <w:tc>
+          <w:tcPr/>
+          <w:p>
+            <w:pPr>
+              <w:pStyle w:val="Compact"/>
+            </w:pPr>
+            <w:r>
+              <w:t xml:space="preserve">partial</w:t>
+            </w:r>
+          </w:p>
+        </w:tc>
+      </w:tr>
+      <w:tr>
+        <w:tc>
+          <w:tcPr/>
+          <w:p>
+            <w:pPr>
+              <w:pStyle w:val="Compact"/>
+            </w:pPr>
+            <w:r>
+              <w:t xml:space="preserve">Planned timed interventions (capacity surge, outage, demand spike, work injection)</w:t>
+            </w:r>
+          </w:p>
+        </w:tc>
+        <w:tc>
+          <w:tcPr/>
+          <w:p>
+            <w:pPr>
+              <w:pStyle w:val="Compact"/>
+            </w:pPr>
+            <w:r>
+              <w:t xml:space="preserve">✅</w:t>
+            </w:r>
+          </w:p>
+        </w:tc>
+        <w:tc>
+          <w:tcPr/>
+          <w:p>
+            <w:pPr>
+              <w:pStyle w:val="Compact"/>
+            </w:pPr>
+            <w:r>
+              <w:t xml:space="preserve">—</w:t>
+            </w:r>
+          </w:p>
+        </w:tc>
+        <w:tc>
+          <w:tcPr/>
+          <w:p>
+            <w:pPr>
+              <w:pStyle w:val="Compact"/>
+            </w:pPr>
+            <w:r>
+              <w:t xml:space="preserve">partial</w:t>
+            </w:r>
+          </w:p>
+        </w:tc>
+        <w:tc>
+          <w:tcPr/>
+          <w:p>
+            <w:pPr>
+              <w:pStyle w:val="Compact"/>
+            </w:pPr>
+            <w:r>
+              <w:t xml:space="preserve">—</w:t>
+            </w:r>
+          </w:p>
+        </w:tc>
+      </w:tr>
+      <w:tr>
+        <w:tc>
+          <w:tcPr/>
+          <w:p>
+            <w:pPr>
+              <w:pStyle w:val="Compact"/>
+            </w:pPr>
+            <w:r>
+              <w:t xml:space="preserve">Standards-based interchange (</w:t>
+            </w:r>
+            <w:r>
+              <w:rPr>
+                <w:b/>
+                <w:bCs/>
+              </w:rPr>
+              <w:t xml:space="preserve">BPSim</w:t>
+            </w:r>
+            <w:r>
+              <w:t xml:space="preserve">)</w:t>
+            </w:r>
+          </w:p>
+        </w:tc>
+        <w:tc>
+          <w:tcPr/>
+          <w:p>
+            <w:pPr>
+              <w:pStyle w:val="Compact"/>
+            </w:pPr>
+            <w:r>
+              <w:t xml:space="preserve">✅</w:t>
+            </w:r>
+            <w:r>
+              <w:t xml:space="preserve"> </w:t>
+            </w:r>
+            <w:r>
+              <w:rPr>
+                <w:b/>
+                <w:bCs/>
+              </w:rPr>
+              <w:t xml:space="preserve">OMG/WfMC BPSim import + export</w:t>
+            </w:r>
+          </w:p>
+        </w:tc>
+        <w:tc>
+          <w:tcPr/>
+          <w:p>
+            <w:pPr>
+              <w:pStyle w:val="Compact"/>
+            </w:pPr>
+            <w:r>
+              <w:t xml:space="preserve">—</w:t>
+            </w:r>
+          </w:p>
+        </w:tc>
+        <w:tc>
+          <w:tcPr/>
+          <w:p>
+            <w:pPr>
+              <w:pStyle w:val="Compact"/>
+            </w:pPr>
+            <w:r>
+              <w:t xml:space="preserve">—</w:t>
+            </w:r>
+          </w:p>
+        </w:tc>
+        <w:tc>
+          <w:tcPr/>
+          <w:p>
+            <w:pPr>
+              <w:pStyle w:val="Compact"/>
+            </w:pPr>
+            <w:r>
+              <w:t xml:space="preserve">—</w:t>
+            </w:r>
+          </w:p>
+        </w:tc>
+      </w:tr>
+      <w:tr>
+        <w:tc>
+          <w:tcPr/>
+          <w:p>
+            <w:pPr>
+              <w:pStyle w:val="Compact"/>
+            </w:pPr>
+            <w:r>
+              <w:t xml:space="preserve">Worked-example library to learn / demo from (one-click load)</w:t>
+            </w:r>
+          </w:p>
+        </w:tc>
+        <w:tc>
+          <w:tcPr/>
+          <w:p>
+            <w:pPr>
+              <w:pStyle w:val="Compact"/>
+            </w:pPr>
+            <w:r>
+              <w:t xml:space="preserve">✅</w:t>
+            </w:r>
+          </w:p>
+        </w:tc>
+        <w:tc>
+          <w:tcPr/>
+          <w:p>
+            <w:pPr>
+              <w:pStyle w:val="Compact"/>
+            </w:pPr>
+            <w:r>
+              <w:t xml:space="preserve">—</w:t>
+            </w:r>
+          </w:p>
+        </w:tc>
+        <w:tc>
+          <w:tcPr/>
+          <w:p>
+            <w:pPr>
+              <w:pStyle w:val="Compact"/>
+            </w:pPr>
+            <w:r>
+              <w:t xml:space="preserve">—</w:t>
+            </w:r>
+          </w:p>
+        </w:tc>
+        <w:tc>
+          <w:tcPr/>
+          <w:p>
+            <w:pPr>
+              <w:pStyle w:val="Compact"/>
+            </w:pPr>
+            <w:r>
+              <w:t xml:space="preserve">—</w:t>
+            </w:r>
+          </w:p>
+        </w:tc>
+      </w:tr>
+      <w:tr>
+        <w:tc>
+          <w:tcPr/>
+          <w:p>
+            <w:pPr>
+              <w:pStyle w:val="Compact"/>
+            </w:pPr>
+            <w:r>
+              <w:t xml:space="preserve">Working-hours</w:t>
+            </w:r>
+            <w:r>
+              <w:t xml:space="preserve"> </w:t>
+            </w:r>
+            <w:r>
+              <w:rPr>
+                <w:b/>
+                <w:bCs/>
+              </w:rPr>
+              <w:t xml:space="preserve">calendars</w:t>
+            </w:r>
+            <w:r>
+              <w:t xml:space="preserve"> </w:t>
+            </w:r>
+            <w:r>
+              <w:t xml:space="preserve">/ shift models</w:t>
+            </w:r>
+          </w:p>
+        </w:tc>
+        <w:tc>
+          <w:tcPr/>
+          <w:p>
+            <w:pPr>
+              <w:pStyle w:val="Compact"/>
+            </w:pPr>
+            <w:r>
+              <w:t xml:space="preserve">⏳ roadmap</w:t>
+            </w:r>
+          </w:p>
+        </w:tc>
+        <w:tc>
+          <w:tcPr/>
+          <w:p>
+            <w:pPr>
+              <w:pStyle w:val="Compact"/>
+            </w:pPr>
+            <w:r>
+              <w:t xml:space="preserve">✅</w:t>
+            </w:r>
+          </w:p>
+        </w:tc>
+        <w:tc>
+          <w:tcPr/>
+          <w:p>
+            <w:pPr>
+              <w:pStyle w:val="Compact"/>
+            </w:pPr>
+            <w:r>
+              <w:t xml:space="preserve">✅</w:t>
+            </w:r>
+          </w:p>
+        </w:tc>
+        <w:tc>
+          <w:tcPr/>
+          <w:p>
+            <w:pPr>
+              <w:pStyle w:val="Compact"/>
+            </w:pPr>
+            <w:r>
+              <w:t xml:space="preserve">✅</w:t>
+            </w:r>
+          </w:p>
+        </w:tc>
+      </w:tr>
+      <w:tr>
+        <w:tc>
+          <w:tcPr/>
+          <w:p>
+            <w:pPr>
+              <w:pStyle w:val="Compact"/>
+            </w:pPr>
+            <w:r>
+              <w:t xml:space="preserve">Self-hosted, per-seat,</w:t>
+            </w:r>
+            <w:r>
+              <w:t xml:space="preserve"> </w:t>
+            </w:r>
+            <w:r>
+              <w:rPr>
+                <w:i/>
+                <w:iCs/>
+              </w:rPr>
+              <w:t xml:space="preserve">no separate simulation module</w:t>
+            </w:r>
+          </w:p>
+        </w:tc>
+        <w:tc>
+          <w:tcPr/>
+          <w:p>
+            <w:pPr>
+              <w:pStyle w:val="Compact"/>
+            </w:pPr>
+            <w:r>
+              <w:t xml:space="preserve">✅</w:t>
+            </w:r>
+          </w:p>
+        </w:tc>
+        <w:tc>
+          <w:tcPr/>
+          <w:p>
+            <w:pPr>
+              <w:pStyle w:val="Compact"/>
+            </w:pPr>
+            <w:r>
+              <w:t xml:space="preserve">❌</w:t>
+            </w:r>
+          </w:p>
+        </w:tc>
+        <w:tc>
+          <w:tcPr/>
+          <w:p>
+            <w:pPr>
+              <w:pStyle w:val="Compact"/>
+            </w:pPr>
+            <w:r>
+              <w:t xml:space="preserve">❌</w:t>
+            </w:r>
+          </w:p>
+        </w:tc>
+        <w:tc>
+          <w:tcPr/>
+          <w:p>
+            <w:pPr>
+              <w:pStyle w:val="Compact"/>
+            </w:pPr>
+            <w:r>
+              <w:t xml:space="preserve">❌</w:t>
+            </w:r>
+          </w:p>
+        </w:tc>
+      </w:tr>
+    </w:tbl>
+    <w:p>
+      <w:pPr>
+        <w:pStyle w:val="BodyText"/>
+      </w:pPr>
+      <w:r>
+        <w:rPr>
+          <w:b/>
+          <w:bCs/>
+        </w:rPr>
+        <w:t xml:space="preserve">What’s distinctive about Diagramatix’s simulation.</w:t>
+      </w:r>
+      <w:r>
+        <w:t xml:space="preserve"> </w:t>
+      </w:r>
+      <w:r>
+        <w:t xml:space="preserve">Three things the suites don’t combine: (1) an</w:t>
+      </w:r>
+      <w:r>
+        <w:t xml:space="preserve"> </w:t>
+      </w:r>
+      <w:r>
+        <w:rPr>
+          <w:b/>
+          <w:bCs/>
+        </w:rPr>
+        <w:t xml:space="preserve">as-is vs to-be</w:t>
+      </w:r>
+      <w:r>
+        <w:t xml:space="preserve"> </w:t>
+      </w:r>
+      <w:r>
+        <w:t xml:space="preserve">comparison that pins each scenario to a</w:t>
+      </w:r>
+      <w:r>
+        <w:t xml:space="preserve"> </w:t>
+      </w:r>
+      <w:r>
+        <w:rPr>
+          <w:i/>
+          <w:iCs/>
+        </w:rPr>
+        <w:t xml:space="preserve">structurally different</w:t>
+      </w:r>
+      <w:r>
+        <w:t xml:space="preserve"> </w:t>
+      </w:r>
+      <w:r>
+        <w:t xml:space="preserve">process variant and returns a</w:t>
+      </w:r>
+      <w:r>
+        <w:t xml:space="preserve"> </w:t>
+      </w:r>
+      <w:r>
+        <w:rPr>
+          <w:b/>
+          <w:bCs/>
+        </w:rPr>
+        <w:t xml:space="preserve">plain-language cost verdict</w:t>
+      </w:r>
+      <w:r>
+        <w:t xml:space="preserve"> </w:t>
+      </w:r>
+      <w:r>
+        <w:t xml:space="preserve">(% faster, throughput, $/case, FTE freed) — turning</w:t>
+      </w:r>
+      <w:r>
+        <w:t xml:space="preserve"> </w:t>
+      </w:r>
+      <w:r>
+        <w:t xml:space="preserve">“X% faster”</w:t>
+      </w:r>
+      <w:r>
+        <w:t xml:space="preserve"> </w:t>
+      </w:r>
+      <w:r>
+        <w:t xml:space="preserve">into a business case; (2) a</w:t>
+      </w:r>
+      <w:r>
+        <w:t xml:space="preserve"> </w:t>
+      </w:r>
+      <w:r>
+        <w:rPr>
+          <w:b/>
+          <w:bCs/>
+        </w:rPr>
+        <w:t xml:space="preserve">live, interactive Operator</w:t>
+      </w:r>
+      <w:r>
+        <w:t xml:space="preserve"> </w:t>
+      </w:r>
+      <w:r>
+        <w:t xml:space="preserve">that lets you intervene</w:t>
+      </w:r>
+      <w:r>
+        <w:t xml:space="preserve"> </w:t>
+      </w:r>
+      <w:r>
+        <w:rPr>
+          <w:i/>
+          <w:iCs/>
+        </w:rPr>
+        <w:t xml:space="preserve">during</w:t>
+      </w:r>
+      <w:r>
+        <w:t xml:space="preserve"> </w:t>
+      </w:r>
+      <w:r>
+        <w:t xml:space="preserve">a slowed-clock replay (</w:t>
+      </w:r>
+      <w:r>
+        <w:t xml:space="preserve">“fork the timeline”</w:t>
+      </w:r>
+      <w:r>
+        <w:t xml:space="preserve">) and watch a backlog clear or build, deterministically; (3)</w:t>
+      </w:r>
+      <w:r>
+        <w:t xml:space="preserve"> </w:t>
+      </w:r>
+      <w:r>
+        <w:rPr>
+          <w:b/>
+          <w:bCs/>
+        </w:rPr>
+        <w:t xml:space="preserve">BPSim</w:t>
+      </w:r>
+      <w:r>
+        <w:t xml:space="preserve"> </w:t>
+      </w:r>
+      <w:r>
+        <w:t xml:space="preserve">(the OMG/WfMC standard) import/export, so simulation parameters interchange with other tools. All of it is</w:t>
+      </w:r>
+      <w:r>
+        <w:t xml:space="preserve"> </w:t>
+      </w:r>
+      <w:r>
+        <w:rPr>
+          <w:b/>
+          <w:bCs/>
+        </w:rPr>
+        <w:t xml:space="preserve">self-hosted</w:t>
+      </w:r>
+      <w:r>
+        <w:t xml:space="preserve"> </w:t>
+      </w:r>
+      <w:r>
+        <w:t xml:space="preserve">and integrated with authoring + AI — no enterprise contract, no separate module.</w:t>
+      </w:r>
+    </w:p>
+    <w:p>
+      <w:pPr>
+        <w:pStyle w:val="BodyText"/>
+      </w:pPr>
+      <w:r>
+        <w:rPr>
+          <w:b/>
+          <w:bCs/>
+        </w:rPr>
+        <w:t xml:space="preserve">Where the suites still lead on simulation.</w:t>
+      </w:r>
+      <w:r>
+        <w:t xml:space="preserve"> </w:t>
+      </w:r>
+      <w:r>
+        <w:t xml:space="preserve">ARIS in particular has a</w:t>
+      </w:r>
+      <w:r>
+        <w:t xml:space="preserve"> </w:t>
+      </w:r>
+      <w:r>
+        <w:rPr>
+          <w:b/>
+          <w:bCs/>
+        </w:rPr>
+        <w:t xml:space="preserve">deeper, more mature</w:t>
+      </w:r>
+      <w:r>
+        <w:t xml:space="preserve"> </w:t>
+      </w:r>
+      <w:r>
+        <w:t xml:space="preserve">engine — richer resource models, working-time</w:t>
+      </w:r>
+      <w:r>
+        <w:t xml:space="preserve"> </w:t>
+      </w:r>
+      <w:r>
+        <w:rPr>
+          <w:b/>
+          <w:bCs/>
+        </w:rPr>
+        <w:t xml:space="preserve">calendars/shifts</w:t>
+      </w:r>
+      <w:r>
+        <w:t xml:space="preserve">, and long-established animation. Diagramatix’s calendar/shift modelling is on the roadmap (it currently treats capacity as continuously available). And neither Diagramatix nor a single simulation run substitutes for</w:t>
+      </w:r>
+      <w:r>
+        <w:t xml:space="preserve"> </w:t>
+      </w:r>
+      <w:r>
+        <w:rPr>
+          <w:b/>
+          <w:bCs/>
+        </w:rPr>
+        <w:t xml:space="preserve">process mining</w:t>
+      </w:r>
+      <w:r>
+        <w:t xml:space="preserve">, where the suites discover the</w:t>
+      </w:r>
+      <w:r>
+        <w:t xml:space="preserve"> </w:t>
+      </w:r>
+      <w:r>
+        <w:rPr>
+          <w:i/>
+          <w:iCs/>
+        </w:rPr>
+        <w:t xml:space="preserve">actual</w:t>
+      </w:r>
+      <w:r>
+        <w:t xml:space="preserve"> </w:t>
+      </w:r>
+      <w:r>
+        <w:t xml:space="preserve">as-is process from event logs rather than relying on modeller-entered estimates.</w:t>
+      </w:r>
+    </w:p>
+    <w:p>
+      <w:r>
+        <w:pict>
+          <v:rect style="width:0;height:1.5pt" o:hralign="center" o:hrstd="t" o:hr="t"/>
+        </w:pict>
+      </w:r>
+    </w:p>
+    <w:bookmarkEnd w:id="16"/>
+    <w:bookmarkEnd w:id="17"/>
+    <w:bookmarkStart w:id="18" w:name="export-interop-deployment"/>
+    <w:p>
+      <w:pPr>
+        <w:pStyle w:val="Heading2"/>
+      </w:pPr>
+      <w:r>
+        <w:t xml:space="preserve">7. Export, interop &amp; deployment</w:t>
+      </w:r>
+    </w:p>
+    <w:tbl>
+      <w:tblPr>
+        <w:tblStyle w:val="Table"/>
+        <w:tblW w:type="pct" w:w="5000"/>
+        <w:tblLayout w:type="fixed"/>
+        <w:tblLook w:firstRow="1" w:lastRow="0" w:firstColumn="0" w:lastColumn="0" w:noHBand="0" w:noVBand="0" w:val="0020"/>
+      </w:tblPr>
+      <w:tblGrid>
+        <w:gridCol w:w="1584"/>
+        <w:gridCol w:w="1584"/>
+        <w:gridCol w:w="1584"/>
+        <w:gridCol w:w="1584"/>
+        <w:gridCol w:w="1584"/>
+      </w:tblGrid>
+      <w:tr>
+        <w:trPr>
+          <w:tblHeader w:val="on"/>
+        </w:trPr>
+        <w:tc>
+          <w:tcPr/>
+          <w:p>
+            <w:pPr>
+              <w:pStyle w:val="Compact"/>
+            </w:pPr>
+            <w:r>
               <w:t xml:space="preserve">Feature</w:t>
             </w:r>
           </w:p>
@@ -4557,8 +5953,8 @@
         </w:pict>
       </w:r>
     </w:p>
-    <w:bookmarkEnd w:id="17"/>
-    <w:bookmarkStart w:id="18" w:name="where-diagramatix-wins"/>
+    <w:bookmarkEnd w:id="18"/>
+    <w:bookmarkStart w:id="19" w:name="where-diagramatix-wins"/>
     <w:p>
       <w:pPr>
         <w:pStyle w:val="Heading2"/>
@@ -4640,13 +6036,54 @@
           <w:b/>
           <w:bCs/>
         </w:rPr>
-        <w:t xml:space="preserve">Interaction polish</w:t>
-      </w:r>
-      <w:r>
-        <w:t xml:space="preserve"> </w:t>
-      </w:r>
-      <w:r>
-        <w:t xml:space="preserve">— drop-on-connector split, insert-space marker, smart auto-connect, force-connect, hand-drawn mode.</w:t>
+        <w:t xml:space="preserve">Built-in discrete-event Simulator</w:t>
+      </w:r>
+      <w:r>
+        <w:t xml:space="preserve"> </w:t>
+      </w:r>
+      <w:r>
+        <w:t xml:space="preserve">— capacity planning +</w:t>
+      </w:r>
+      <w:r>
+        <w:t xml:space="preserve"> </w:t>
+      </w:r>
+      <w:r>
+        <w:rPr>
+          <w:b/>
+          <w:bCs/>
+        </w:rPr>
+        <w:t xml:space="preserve">as-is vs to-be cost comparison with a plain-language verdict</w:t>
+      </w:r>
+      <w:r>
+        <w:t xml:space="preserve">, a live</w:t>
+      </w:r>
+      <w:r>
+        <w:t xml:space="preserve"> </w:t>
+      </w:r>
+      <w:r>
+        <w:t xml:space="preserve">“fork-the-timeline”</w:t>
+      </w:r>
+      <w:r>
+        <w:t xml:space="preserve"> </w:t>
+      </w:r>
+      <w:r>
+        <w:t xml:space="preserve">Operator, planned interventions, Monte-Carlo ranges, and</w:t>
+      </w:r>
+      <w:r>
+        <w:t xml:space="preserve"> </w:t>
+      </w:r>
+      <w:r>
+        <w:rPr>
+          <w:b/>
+          <w:bCs/>
+        </w:rPr>
+        <w:t xml:space="preserve">BPSim</w:t>
+      </w:r>
+      <w:r>
+        <w:t xml:space="preserve"> </w:t>
+      </w:r>
+      <w:r>
+        <w:t xml:space="preserve">import/export — all self-hosted, in the same tool, with no separate enterprise simulation module.</w:t>
       </w:r>
     </w:p>
     <w:p>
@@ -4662,13 +6099,13 @@
           <w:b/>
           <w:bCs/>
         </w:rPr>
-        <w:t xml:space="preserve">Multi-notation in one focused tool</w:t>
-      </w:r>
-      <w:r>
-        <w:t xml:space="preserve"> </w:t>
-      </w:r>
-      <w:r>
-        <w:t xml:space="preserve">— BPMN + 6 other types without enterprise-suite weight.</w:t>
+        <w:t xml:space="preserve">Interaction polish</w:t>
+      </w:r>
+      <w:r>
+        <w:t xml:space="preserve"> </w:t>
+      </w:r>
+      <w:r>
+        <w:t xml:space="preserve">— drop-on-connector split, insert-space marker, smart auto-connect, force-connect, hand-drawn mode.</w:t>
       </w:r>
     </w:p>
     <w:p>
@@ -4684,10 +6121,13 @@
           <w:b/>
           <w:bCs/>
         </w:rPr>
-        <w:t xml:space="preserve">Self-hosted, no ecosystem lock-in</w:t>
-      </w:r>
-      <w:r>
-        <w:t xml:space="preserve">, per-seat pricing.</w:t>
+        <w:t xml:space="preserve">Multi-notation in one focused tool</w:t>
+      </w:r>
+      <w:r>
+        <w:t xml:space="preserve"> </w:t>
+      </w:r>
+      <w:r>
+        <w:t xml:space="preserve">— BPMN + 6 other types without enterprise-suite weight.</w:t>
       </w:r>
     </w:p>
     <w:p>
@@ -4703,29 +6143,10 @@
           <w:b/>
           <w:bCs/>
         </w:rPr>
-        <w:t xml:space="preserve">Visio round-trip</w:t>
-      </w:r>
-      <w:r>
-        <w:t xml:space="preserve"> </w:t>
-      </w:r>
-      <w:r>
-        <w:t xml:space="preserve">with a purpose-built shapes file, plus the niche</w:t>
-      </w:r>
-      <w:r>
-        <w:t xml:space="preserve"> </w:t>
-      </w:r>
-      <w:r>
-        <w:rPr>
-          <w:b/>
-          <w:bCs/>
-        </w:rPr>
-        <w:t xml:space="preserve">DDL ↔ Domain</w:t>
-      </w:r>
-      <w:r>
-        <w:t xml:space="preserve"> </w:t>
-      </w:r>
-      <w:r>
-        <w:t xml:space="preserve">round-trip.</w:t>
+        <w:t xml:space="preserve">Self-hosted, no ecosystem lock-in</w:t>
+      </w:r>
+      <w:r>
+        <w:t xml:space="preserve">, per-seat pricing.</w:t>
       </w:r>
     </w:p>
     <w:p>
@@ -4741,6 +6162,44 @@
           <w:b/>
           <w:bCs/>
         </w:rPr>
+        <w:t xml:space="preserve">Visio round-trip</w:t>
+      </w:r>
+      <w:r>
+        <w:t xml:space="preserve"> </w:t>
+      </w:r>
+      <w:r>
+        <w:t xml:space="preserve">with a purpose-built shapes file, plus the niche</w:t>
+      </w:r>
+      <w:r>
+        <w:t xml:space="preserve"> </w:t>
+      </w:r>
+      <w:r>
+        <w:rPr>
+          <w:b/>
+          <w:bCs/>
+        </w:rPr>
+        <w:t xml:space="preserve">DDL ↔ Domain</w:t>
+      </w:r>
+      <w:r>
+        <w:t xml:space="preserve"> </w:t>
+      </w:r>
+      <w:r>
+        <w:t xml:space="preserve">round-trip.</w:t>
+      </w:r>
+    </w:p>
+    <w:p>
+      <w:pPr>
+        <w:pStyle w:val="Compact"/>
+        <w:numPr>
+          <w:ilvl w:val="0"/>
+          <w:numId w:val="1002"/>
+        </w:numPr>
+      </w:pPr>
+      <w:r>
+        <w:rPr>
+          <w:b/>
+          <w:bCs/>
+        </w:rPr>
         <w:t xml:space="preserve">Built-in lightweight review loop</w:t>
       </w:r>
       <w:r>
@@ -4750,8 +6209,8 @@
         <w:t xml:space="preserve">for small teams.</w:t>
       </w:r>
     </w:p>
-    <w:bookmarkEnd w:id="18"/>
-    <w:bookmarkStart w:id="19" w:name="where-each-competitor-wins"/>
+    <w:bookmarkEnd w:id="19"/>
+    <w:bookmarkStart w:id="20" w:name="where-each-competitor-wins"/>
     <w:p>
       <w:pPr>
         <w:pStyle w:val="Heading2"/>
@@ -4779,7 +6238,20 @@
         <w:t xml:space="preserve"> </w:t>
       </w:r>
       <w:r>
-        <w:t xml:space="preserve">SAP best-practice grounding for AI, process mining, simulation, formal governance/publishing, Cloud ALM execution bridge, CMMN/DMN.</w:t>
+        <w:t xml:space="preserve">SAP best-practice grounding for AI,</w:t>
+      </w:r>
+      <w:r>
+        <w:t xml:space="preserve"> </w:t>
+      </w:r>
+      <w:r>
+        <w:rPr>
+          <w:b/>
+          <w:bCs/>
+        </w:rPr>
+        <w:t xml:space="preserve">process mining</w:t>
+      </w:r>
+      <w:r>
+        <w:t xml:space="preserve">, formal governance/publishing, Cloud ALM execution bridge, CMMN/DMN. (Simulation exists, but Diagramatix now competes here.)</w:t>
       </w:r>
     </w:p>
     <w:p>
@@ -4801,7 +6273,36 @@
         <w:t xml:space="preserve"> </w:t>
       </w:r>
       <w:r>
-        <w:t xml:space="preserve">EPC + broad notation set, enterprise repository &amp; EA breadth, process mining, AI Companion that also works over mining data, governance/audit depth.</w:t>
+        <w:t xml:space="preserve">EPC + broad notation set, enterprise repository &amp; EA breadth,</w:t>
+      </w:r>
+      <w:r>
+        <w:t xml:space="preserve"> </w:t>
+      </w:r>
+      <w:r>
+        <w:rPr>
+          <w:b/>
+          <w:bCs/>
+        </w:rPr>
+        <w:t xml:space="preserve">process mining</w:t>
+      </w:r>
+      <w:r>
+        <w:t xml:space="preserve">, a</w:t>
+      </w:r>
+      <w:r>
+        <w:t xml:space="preserve"> </w:t>
+      </w:r>
+      <w:r>
+        <w:rPr>
+          <w:b/>
+          <w:bCs/>
+        </w:rPr>
+        <w:t xml:space="preserve">deeper/more mature simulation engine</w:t>
+      </w:r>
+      <w:r>
+        <w:t xml:space="preserve"> </w:t>
+      </w:r>
+      <w:r>
+        <w:t xml:space="preserve">(calendars, advanced resource models, animation), AI Companion that also works over mining data, governance/audit depth.</w:t>
       </w:r>
     </w:p>
     <w:p>
@@ -4826,8 +6327,8 @@
         <w:t xml:space="preserve">multi-modal AI capture (audio/video/Excel/conversation → map), built-in improvement analytics (cost/time/VA-NVA, future-state simulation), SOP generation.</w:t>
       </w:r>
     </w:p>
-    <w:bookmarkEnd w:id="19"/>
-    <w:bookmarkStart w:id="20" w:name="positioning-diagramatix"/>
+    <w:bookmarkEnd w:id="20"/>
+    <w:bookmarkStart w:id="21" w:name="positioning-diagramatix"/>
     <w:p>
       <w:pPr>
         <w:pStyle w:val="Heading2"/>
@@ -4892,36 +6393,39 @@
         </w:numPr>
       </w:pPr>
       <w:r>
-        <w:t xml:space="preserve">“Round-trips</w:t>
-      </w:r>
-      <w:r>
-        <w:t xml:space="preserve"> </w:t>
-      </w:r>
-      <w:r>
-        <w:rPr>
-          <w:b/>
-          <w:bCs/>
-        </w:rPr>
-        <w:t xml:space="preserve">Visio</w:t>
-      </w:r>
-      <w:r>
-        <w:t xml:space="preserve"> </w:t>
-      </w:r>
-      <w:r>
-        <w:t xml:space="preserve">and BPMN XML;</w:t>
-      </w:r>
-      <w:r>
-        <w:t xml:space="preserve"> </w:t>
-      </w:r>
-      <w:r>
-        <w:rPr>
-          <w:b/>
-          <w:bCs/>
-        </w:rPr>
-        <w:t xml:space="preserve">self-hosted</w:t>
-      </w:r>
-      <w:r>
-        <w:t xml:space="preserve">, per-seat — no enterprise contract.”</w:t>
+        <w:t xml:space="preserve">“Model it, then</w:t>
+      </w:r>
+      <w:r>
+        <w:t xml:space="preserve"> </w:t>
+      </w:r>
+      <w:r>
+        <w:rPr>
+          <w:b/>
+          <w:bCs/>
+        </w:rPr>
+        <w:t xml:space="preserve">simulate it</w:t>
+      </w:r>
+      <w:r>
+        <w:t xml:space="preserve"> </w:t>
+      </w:r>
+      <w:r>
+        <w:t xml:space="preserve">— capacity, bottlenecks, and the</w:t>
+      </w:r>
+      <w:r>
+        <w:t xml:space="preserve"> </w:t>
+      </w:r>
+      <w:r>
+        <w:rPr>
+          <w:b/>
+          <w:bCs/>
+        </w:rPr>
+        <w:t xml:space="preserve">cost case for a redesign</w:t>
+      </w:r>
+      <w:r>
+        <w:t xml:space="preserve"> </w:t>
+      </w:r>
+      <w:r>
+        <w:t xml:space="preserve">(as-is vs to-be), without a separate enterprise tool.”</w:t>
       </w:r>
     </w:p>
     <w:p>
@@ -4933,11 +6437,78 @@
         </w:numPr>
       </w:pPr>
       <w:r>
-        <w:t xml:space="preserve">“All the authoring, AI and review a team needs — none of the suite bloat.”</w:t>
+        <w:t xml:space="preserve">“Round-trips</w:t>
+      </w:r>
+      <w:r>
+        <w:t xml:space="preserve"> </w:t>
+      </w:r>
+      <w:r>
+        <w:rPr>
+          <w:b/>
+          <w:bCs/>
+        </w:rPr>
+        <w:t xml:space="preserve">Visio</w:t>
+      </w:r>
+      <w:r>
+        <w:t xml:space="preserve">, BPMN XML and</w:t>
+      </w:r>
+      <w:r>
+        <w:t xml:space="preserve"> </w:t>
+      </w:r>
+      <w:r>
+        <w:rPr>
+          <w:b/>
+          <w:bCs/>
+        </w:rPr>
+        <w:t xml:space="preserve">BPSim</w:t>
+      </w:r>
+      <w:r>
+        <w:t xml:space="preserve">;</w:t>
+      </w:r>
+      <w:r>
+        <w:t xml:space="preserve"> </w:t>
+      </w:r>
+      <w:r>
+        <w:rPr>
+          <w:b/>
+          <w:bCs/>
+        </w:rPr>
+        <w:t xml:space="preserve">self-hosted</w:t>
+      </w:r>
+      <w:r>
+        <w:t xml:space="preserve">, per-seat — no enterprise contract.”</w:t>
       </w:r>
     </w:p>
     <w:p>
       <w:pPr>
+        <w:pStyle w:val="Compact"/>
+        <w:numPr>
+          <w:ilvl w:val="0"/>
+          <w:numId w:val="1004"/>
+        </w:numPr>
+      </w:pPr>
+      <w:r>
+        <w:t xml:space="preserve">“All the authoring, AI, review</w:t>
+      </w:r>
+      <w:r>
+        <w:t xml:space="preserve"> </w:t>
+      </w:r>
+      <w:r>
+        <w:rPr>
+          <w:b/>
+          <w:bCs/>
+        </w:rPr>
+        <w:t xml:space="preserve">and simulation</w:t>
+      </w:r>
+      <w:r>
+        <w:t xml:space="preserve"> </w:t>
+      </w:r>
+      <w:r>
+        <w:t xml:space="preserve">a team needs — none of the suite bloat.”</w:t>
+      </w:r>
+    </w:p>
+    <w:p>
+      <w:pPr>
         <w:pStyle w:val="FirstParagraph"/>
       </w:pPr>
       <w:r>
@@ -4957,7 +6528,23 @@
         <w:t xml:space="preserve"> </w:t>
       </w:r>
       <w:r>
-        <w:t xml:space="preserve">to compete: process mining / real event-log analysis, formal enterprise governance lifecycle, SAP-ecosystem execution, and (for ARIS) EPC + EA repository breadth.</w:t>
+        <w:t xml:space="preserve">to compete:</w:t>
+      </w:r>
+      <w:r>
+        <w:t xml:space="preserve"> </w:t>
+      </w:r>
+      <w:r>
+        <w:rPr>
+          <w:b/>
+          <w:bCs/>
+        </w:rPr>
+        <w:t xml:space="preserve">process mining / real event-log analysis</w:t>
+      </w:r>
+      <w:r>
+        <w:t xml:space="preserve"> </w:t>
+      </w:r>
+      <w:r>
+        <w:t xml:space="preserve">(the suites discover the actual process from logs; Diagramatix simulates modeller-entered estimates), formal enterprise governance lifecycle, SAP-ecosystem execution, deep/mature simulation with shift calendars (ARIS), and (for ARIS) EPC + EA repository breadth.</w:t>
       </w:r>
     </w:p>
     <w:p>
@@ -4967,8 +6554,8 @@
         </w:pict>
       </w:r>
     </w:p>
-    <w:bookmarkEnd w:id="20"/>
-    <w:bookmarkStart w:id="31" w:name="sources"/>
+    <w:bookmarkEnd w:id="21"/>
+    <w:bookmarkStart w:id="32" w:name="sources"/>
     <w:p>
       <w:pPr>
         <w:pStyle w:val="Heading2"/>
@@ -5012,7 +6599,7 @@
           <w:numId w:val="1005"/>
         </w:numPr>
       </w:pPr>
-      <w:hyperlink r:id="rId21">
+      <w:hyperlink r:id="rId22">
         <w:r>
           <w:rPr>
             <w:rStyle w:val="Hyperlink"/>
@@ -5029,7 +6616,7 @@
           <w:numId w:val="1005"/>
         </w:numPr>
       </w:pPr>
-      <w:hyperlink r:id="rId22">
+      <w:hyperlink r:id="rId23">
         <w:r>
           <w:rPr>
             <w:rStyle w:val="Hyperlink"/>
@@ -5046,7 +6633,7 @@
           <w:numId w:val="1005"/>
         </w:numPr>
       </w:pPr>
-      <w:hyperlink r:id="rId23">
+      <w:hyperlink r:id="rId24">
         <w:r>
           <w:rPr>
             <w:rStyle w:val="Hyperlink"/>
@@ -5063,7 +6650,7 @@
           <w:numId w:val="1005"/>
         </w:numPr>
       </w:pPr>
-      <w:hyperlink r:id="rId24">
+      <w:hyperlink r:id="rId25">
         <w:r>
           <w:rPr>
             <w:rStyle w:val="Hyperlink"/>
@@ -5080,7 +6667,7 @@
           <w:numId w:val="1005"/>
         </w:numPr>
       </w:pPr>
-      <w:hyperlink r:id="rId25">
+      <w:hyperlink r:id="rId26">
         <w:r>
           <w:rPr>
             <w:rStyle w:val="Hyperlink"/>
@@ -5097,7 +6684,7 @@
           <w:numId w:val="1005"/>
         </w:numPr>
       </w:pPr>
-      <w:hyperlink r:id="rId26">
+      <w:hyperlink r:id="rId27">
         <w:r>
           <w:rPr>
             <w:rStyle w:val="Hyperlink"/>
@@ -5114,7 +6701,7 @@
           <w:numId w:val="1005"/>
         </w:numPr>
       </w:pPr>
-      <w:hyperlink r:id="rId27">
+      <w:hyperlink r:id="rId28">
         <w:r>
           <w:rPr>
             <w:rStyle w:val="Hyperlink"/>
@@ -5131,7 +6718,7 @@
           <w:numId w:val="1005"/>
         </w:numPr>
       </w:pPr>
-      <w:hyperlink r:id="rId28">
+      <w:hyperlink r:id="rId29">
         <w:r>
           <w:rPr>
             <w:rStyle w:val="Hyperlink"/>
@@ -5148,7 +6735,7 @@
           <w:numId w:val="1005"/>
         </w:numPr>
       </w:pPr>
-      <w:hyperlink r:id="rId29">
+      <w:hyperlink r:id="rId30">
         <w:r>
           <w:rPr>
             <w:rStyle w:val="Hyperlink"/>
@@ -5165,7 +6752,7 @@
           <w:numId w:val="1005"/>
         </w:numPr>
       </w:pPr>
-      <w:hyperlink r:id="rId30">
+      <w:hyperlink r:id="rId31">
         <w:r>
           <w:rPr>
             <w:rStyle w:val="Hyperlink"/>
@@ -5174,8 +6761,8 @@
         </w:r>
       </w:hyperlink>
     </w:p>
-    <w:bookmarkEnd w:id="31"/>
     <w:bookmarkEnd w:id="32"/>
+    <w:bookmarkEnd w:id="33"/>
     <w:sectPr>
       <w:footnotePr>
         <w:numRestart w:val="eachSect"/>

</xml_diff>

<commit_message>
docs(competitors): correct Diagramatix review/publishing from "Basic" to mid-tier
The §5 row understated Diagramatix: it has a real publishing lifecycle, not just
review rounds + version history. Added rows for versioned publishing (immutable/
superseded), publish-to-business-user-audience (publication bundles + invite-by-
email + read-only viewer w/ link traversal), and scheduled re-review reminders
(cron review-due). Re-rated "formal approval/publishing lifecycle" to Mid with
the honest gap (no configurable BPMN approval-workflow engine or full audit log).
Updated the §5 verdict + the "where Diagramatix wins" item. Regenerated the docx.

Co-Authored-By: Claude Opus 4.8 <noreply@anthropic.com>
</commit_message>
<xml_diff>
--- a/competitors/diagramatix-vs-signavio-aris-primebpm.docx
+++ b/competitors/diagramatix-vs-signavio-aris-primebpm.docx
@@ -3690,18 +3690,28 @@
               <w:pStyle w:val="Compact"/>
             </w:pPr>
             <w:r>
-              <w:t xml:space="preserve">Real-time multi-user co-editing</w:t>
-            </w:r>
-          </w:p>
-        </w:tc>
-        <w:tc>
-          <w:tcPr/>
-          <w:p>
-            <w:pPr>
-              <w:pStyle w:val="Compact"/>
-            </w:pPr>
-            <w:r>
-              <w:t xml:space="preserve">❌ Single-editor</w:t>
+              <w:rPr>
+                <w:b/>
+                <w:bCs/>
+              </w:rPr>
+              <w:t xml:space="preserve">Versioned publishing</w:t>
+            </w:r>
+            <w:r>
+              <w:t xml:space="preserve"> </w:t>
+            </w:r>
+            <w:r>
+              <w:t xml:space="preserve">— immutable published versions, current-version pointer, supersedure</w:t>
+            </w:r>
+          </w:p>
+        </w:tc>
+        <w:tc>
+          <w:tcPr/>
+          <w:p>
+            <w:pPr>
+              <w:pStyle w:val="Compact"/>
+            </w:pPr>
+            <w:r>
+              <w:t xml:space="preserve">✅</w:t>
             </w:r>
           </w:p>
         </w:tc>
@@ -3747,18 +3757,303 @@
               <w:pStyle w:val="Compact"/>
             </w:pPr>
             <w:r>
-              <w:t xml:space="preserve">Formal approval/publishing lifecycle + audit</w:t>
-            </w:r>
-          </w:p>
-        </w:tc>
-        <w:tc>
-          <w:tcPr/>
-          <w:p>
-            <w:pPr>
-              <w:pStyle w:val="Compact"/>
-            </w:pPr>
-            <w:r>
-              <w:t xml:space="preserve">Basic (review rounds + version history)</w:t>
+              <w:rPr>
+                <w:b/>
+                <w:bCs/>
+              </w:rPr>
+              <w:t xml:space="preserve">Publish to a business-user audience</w:t>
+            </w:r>
+            <w:r>
+              <w:t xml:space="preserve"> </w:t>
+            </w:r>
+            <w:r>
+              <w:t xml:space="preserve">— read-only viewer + cross-diagram link traversal</w:t>
+            </w:r>
+          </w:p>
+        </w:tc>
+        <w:tc>
+          <w:tcPr/>
+          <w:p>
+            <w:pPr>
+              <w:pStyle w:val="Compact"/>
+            </w:pPr>
+            <w:r>
+              <w:t xml:space="preserve">✅</w:t>
+            </w:r>
+            <w:r>
+              <w:t xml:space="preserve"> </w:t>
+            </w:r>
+            <w:r>
+              <w:rPr>
+                <w:b/>
+                <w:bCs/>
+              </w:rPr>
+              <w:t xml:space="preserve">Publication bundles</w:t>
+            </w:r>
+            <w:r>
+              <w:t xml:space="preserve"> </w:t>
+            </w:r>
+            <w:r>
+              <w:t xml:space="preserve">to</w:t>
+            </w:r>
+            <w:r>
+              <w:t xml:space="preserve"> </w:t>
+            </w:r>
+            <w:r>
+              <w:rPr>
+                <w:i/>
+                <w:iCs/>
+              </w:rPr>
+              <w:t xml:space="preserve">explicit</w:t>
+            </w:r>
+            <w:r>
+              <w:t xml:space="preserve"> </w:t>
+            </w:r>
+            <w:r>
+              <w:t xml:space="preserve">audiences,</w:t>
+            </w:r>
+            <w:r>
+              <w:t xml:space="preserve"> </w:t>
+            </w:r>
+            <w:r>
+              <w:rPr>
+                <w:b/>
+                <w:bCs/>
+              </w:rPr>
+              <w:t xml:space="preserve">invite-by-email</w:t>
+            </w:r>
+            <w:r>
+              <w:t xml:space="preserve">, dedicated viewer</w:t>
+            </w:r>
+          </w:p>
+        </w:tc>
+        <w:tc>
+          <w:tcPr/>
+          <w:p>
+            <w:pPr>
+              <w:pStyle w:val="Compact"/>
+            </w:pPr>
+            <w:r>
+              <w:t xml:space="preserve">✅ (portal/publishing)</w:t>
+            </w:r>
+          </w:p>
+        </w:tc>
+        <w:tc>
+          <w:tcPr/>
+          <w:p>
+            <w:pPr>
+              <w:pStyle w:val="Compact"/>
+            </w:pPr>
+            <w:r>
+              <w:t xml:space="preserve">✅ (publishing)</w:t>
+            </w:r>
+          </w:p>
+        </w:tc>
+        <w:tc>
+          <w:tcPr/>
+          <w:p>
+            <w:pPr>
+              <w:pStyle w:val="Compact"/>
+            </w:pPr>
+            <w:r>
+              <w:t xml:space="preserve">✅</w:t>
+            </w:r>
+          </w:p>
+        </w:tc>
+      </w:tr>
+      <w:tr>
+        <w:tc>
+          <w:tcPr/>
+          <w:p>
+            <w:pPr>
+              <w:pStyle w:val="Compact"/>
+            </w:pPr>
+            <w:r>
+              <w:rPr>
+                <w:b/>
+                <w:bCs/>
+              </w:rPr>
+              <w:t xml:space="preserve">Scheduled re-review</w:t>
+            </w:r>
+            <w:r>
+              <w:t xml:space="preserve"> </w:t>
+            </w:r>
+            <w:r>
+              <w:t xml:space="preserve">— review cadence + automated review-due reminders</w:t>
+            </w:r>
+          </w:p>
+        </w:tc>
+        <w:tc>
+          <w:tcPr/>
+          <w:p>
+            <w:pPr>
+              <w:pStyle w:val="Compact"/>
+            </w:pPr>
+            <w:r>
+              <w:t xml:space="preserve">✅ owner-set next-review date / cadence;</w:t>
+            </w:r>
+            <w:r>
+              <w:t xml:space="preserve"> </w:t>
+            </w:r>
+            <w:r>
+              <w:rPr>
+                <w:b/>
+                <w:bCs/>
+              </w:rPr>
+              <w:t xml:space="preserve">cron review-due notifications</w:t>
+            </w:r>
+          </w:p>
+        </w:tc>
+        <w:tc>
+          <w:tcPr/>
+          <w:p>
+            <w:pPr>
+              <w:pStyle w:val="Compact"/>
+            </w:pPr>
+            <w:r>
+              <w:t xml:space="preserve">✅</w:t>
+            </w:r>
+          </w:p>
+        </w:tc>
+        <w:tc>
+          <w:tcPr/>
+          <w:p>
+            <w:pPr>
+              <w:pStyle w:val="Compact"/>
+            </w:pPr>
+            <w:r>
+              <w:t xml:space="preserve">✅</w:t>
+            </w:r>
+          </w:p>
+        </w:tc>
+        <w:tc>
+          <w:tcPr/>
+          <w:p>
+            <w:pPr>
+              <w:pStyle w:val="Compact"/>
+            </w:pPr>
+            <w:r>
+              <w:t xml:space="preserve">✅</w:t>
+            </w:r>
+          </w:p>
+        </w:tc>
+      </w:tr>
+      <w:tr>
+        <w:tc>
+          <w:tcPr/>
+          <w:p>
+            <w:pPr>
+              <w:pStyle w:val="Compact"/>
+            </w:pPr>
+            <w:r>
+              <w:t xml:space="preserve">Real-time multi-user co-editing</w:t>
+            </w:r>
+          </w:p>
+        </w:tc>
+        <w:tc>
+          <w:tcPr/>
+          <w:p>
+            <w:pPr>
+              <w:pStyle w:val="Compact"/>
+            </w:pPr>
+            <w:r>
+              <w:t xml:space="preserve">❌ Single-editor</w:t>
+            </w:r>
+          </w:p>
+        </w:tc>
+        <w:tc>
+          <w:tcPr/>
+          <w:p>
+            <w:pPr>
+              <w:pStyle w:val="Compact"/>
+            </w:pPr>
+            <w:r>
+              <w:t xml:space="preserve">✅</w:t>
+            </w:r>
+          </w:p>
+        </w:tc>
+        <w:tc>
+          <w:tcPr/>
+          <w:p>
+            <w:pPr>
+              <w:pStyle w:val="Compact"/>
+            </w:pPr>
+            <w:r>
+              <w:t xml:space="preserve">✅</w:t>
+            </w:r>
+          </w:p>
+        </w:tc>
+        <w:tc>
+          <w:tcPr/>
+          <w:p>
+            <w:pPr>
+              <w:pStyle w:val="Compact"/>
+            </w:pPr>
+            <w:r>
+              <w:t xml:space="preserve">✅</w:t>
+            </w:r>
+          </w:p>
+        </w:tc>
+      </w:tr>
+      <w:tr>
+        <w:tc>
+          <w:tcPr/>
+          <w:p>
+            <w:pPr>
+              <w:pStyle w:val="Compact"/>
+            </w:pPr>
+            <w:r>
+              <w:t xml:space="preserve">Formal approval-</w:t>
+            </w:r>
+            <w:r>
+              <w:rPr>
+                <w:i/>
+                <w:iCs/>
+              </w:rPr>
+              <w:t xml:space="preserve">workflow</w:t>
+            </w:r>
+            <w:r>
+              <w:t xml:space="preserve"> </w:t>
+            </w:r>
+            <w:r>
+              <w:t xml:space="preserve">engine + enterprise audit log</w:t>
+            </w:r>
+          </w:p>
+        </w:tc>
+        <w:tc>
+          <w:tcPr/>
+          <w:p>
+            <w:pPr>
+              <w:pStyle w:val="Compact"/>
+            </w:pPr>
+            <w:r>
+              <w:rPr>
+                <w:b/>
+                <w:bCs/>
+              </w:rPr>
+              <w:t xml:space="preserve">Mid</w:t>
+            </w:r>
+            <w:r>
+              <w:t xml:space="preserve"> </w:t>
+            </w:r>
+            <w:r>
+              <w:t xml:space="preserve">— draft→published lifecycle, versioned + superseded, bundle publishing to audiences, review-cadence reminders;</w:t>
+            </w:r>
+            <w:r>
+              <w:t xml:space="preserve"> </w:t>
+            </w:r>
+            <w:r>
+              <w:rPr>
+                <w:i/>
+                <w:iCs/>
+              </w:rPr>
+              <w:t xml:space="preserve">not</w:t>
+            </w:r>
+            <w:r>
+              <w:t xml:space="preserve"> </w:t>
+            </w:r>
+            <w:r>
+              <w:t xml:space="preserve">a configurable approval-workflow engine or full audit log</w:t>
             </w:r>
           </w:p>
         </w:tc>
@@ -3812,23 +4107,62 @@
         <w:t xml:space="preserve"> </w:t>
       </w:r>
       <w:r>
-        <w:t xml:space="preserve">Diagramatix now has a</w:t>
-      </w:r>
-      <w:r>
-        <w:t xml:space="preserve"> </w:t>
-      </w:r>
-      <w:r>
-        <w:rPr>
-          <w:b/>
-          <w:bCs/>
-        </w:rPr>
-        <w:t xml:space="preserve">genuine, lightweight review loop</w:t>
-      </w:r>
-      <w:r>
-        <w:t xml:space="preserve"> </w:t>
-      </w:r>
-      <w:r>
-        <w:t xml:space="preserve">(send → comment → approve/decline → re-submit → finish), which closes a gap versus the suites for small-team use. The suites still win on</w:t>
+        <w:t xml:space="preserve">Diagramatix is</w:t>
+      </w:r>
+      <w:r>
+        <w:t xml:space="preserve"> </w:t>
+      </w:r>
+      <w:r>
+        <w:rPr>
+          <w:b/>
+          <w:bCs/>
+        </w:rPr>
+        <w:t xml:space="preserve">mid-tier, not basic, on review + publishing</w:t>
+      </w:r>
+      <w:r>
+        <w:t xml:space="preserve">: a genuine review loop (send → comment → approve/decline → re-submit → finish)</w:t>
+      </w:r>
+      <w:r>
+        <w:t xml:space="preserve"> </w:t>
+      </w:r>
+      <w:r>
+        <w:rPr>
+          <w:i/>
+          <w:iCs/>
+        </w:rPr>
+        <w:t xml:space="preserve">and</w:t>
+      </w:r>
+      <w:r>
+        <w:t xml:space="preserve"> </w:t>
+      </w:r>
+      <w:r>
+        <w:t xml:space="preserve">a real publishing lifecycle — draft→published, immutable/superseded versions,</w:t>
+      </w:r>
+      <w:r>
+        <w:t xml:space="preserve"> </w:t>
+      </w:r>
+      <w:r>
+        <w:rPr>
+          <w:b/>
+          <w:bCs/>
+        </w:rPr>
+        <w:t xml:space="preserve">publication bundles published to business-user audiences (invite-by-email) with a read-only viewer</w:t>
+      </w:r>
+      <w:r>
+        <w:t xml:space="preserve">, and</w:t>
+      </w:r>
+      <w:r>
+        <w:t xml:space="preserve"> </w:t>
+      </w:r>
+      <w:r>
+        <w:rPr>
+          <w:b/>
+          <w:bCs/>
+        </w:rPr>
+        <w:t xml:space="preserve">scheduled re-review reminders</w:t>
+      </w:r>
+      <w:r>
+        <w:t xml:space="preserve">. That closes most of the small-team gap versus the suites. They still win on</w:t>
       </w:r>
       <w:r>
         <w:t xml:space="preserve"> </w:t>
@@ -3841,20 +4175,30 @@
         <w:t xml:space="preserve">real-time co-editing</w:t>
       </w:r>
       <w:r>
-        <w:t xml:space="preserve"> </w:t>
-      </w:r>
-      <w:r>
-        <w:t xml:space="preserve">and</w:t>
-      </w:r>
-      <w:r>
-        <w:t xml:space="preserve"> </w:t>
-      </w:r>
-      <w:r>
-        <w:rPr>
-          <w:b/>
-          <w:bCs/>
-        </w:rPr>
-        <w:t xml:space="preserve">formal, audited approval/publishing governance</w:t>
+        <w:t xml:space="preserve">, a</w:t>
+      </w:r>
+      <w:r>
+        <w:t xml:space="preserve"> </w:t>
+      </w:r>
+      <w:r>
+        <w:rPr>
+          <w:b/>
+          <w:bCs/>
+        </w:rPr>
+        <w:t xml:space="preserve">configurable BPMN approval-workflow engine</w:t>
+      </w:r>
+      <w:r>
+        <w:t xml:space="preserve">, and a</w:t>
+      </w:r>
+      <w:r>
+        <w:t xml:space="preserve"> </w:t>
+      </w:r>
+      <w:r>
+        <w:rPr>
+          <w:b/>
+          <w:bCs/>
+        </w:rPr>
+        <w:t xml:space="preserve">full enterprise audit log</w:t>
       </w:r>
       <w:r>
         <w:t xml:space="preserve">.</w:t>
@@ -6200,13 +6544,29 @@
           <w:b/>
           <w:bCs/>
         </w:rPr>
-        <w:t xml:space="preserve">Built-in lightweight review loop</w:t>
-      </w:r>
-      <w:r>
-        <w:t xml:space="preserve"> </w:t>
-      </w:r>
-      <w:r>
-        <w:t xml:space="preserve">for small teams.</w:t>
+        <w:t xml:space="preserve">Review + publishing lifecycle</w:t>
+      </w:r>
+      <w:r>
+        <w:t xml:space="preserve"> </w:t>
+      </w:r>
+      <w:r>
+        <w:t xml:space="preserve">— send-for-review rounds</w:t>
+      </w:r>
+      <w:r>
+        <w:t xml:space="preserve"> </w:t>
+      </w:r>
+      <w:r>
+        <w:rPr>
+          <w:i/>
+          <w:iCs/>
+        </w:rPr>
+        <w:t xml:space="preserve">plus</w:t>
+      </w:r>
+      <w:r>
+        <w:t xml:space="preserve"> </w:t>
+      </w:r>
+      <w:r>
+        <w:t xml:space="preserve">draft→published versioning, publication bundles to a business-user audience (invite-by-email + read-only viewer), and scheduled re-review reminders.</w:t>
       </w:r>
     </w:p>
     <w:bookmarkEnd w:id="19"/>

</xml_diff>

<commit_message>
docs(competitors): refresh for the full published feature set
Now that all 26 features are published, wove the remaining competitively-
relevant ones into the comparison: governed naming (Entity Lists ~ Signavio
Dictionary / ARIS repository) in section 3; role-based project sharing +
OrgAdmin tier in section 5 (renamed "Collaboration, Review & Access");
Microsoft 365 (SharePoint/OneDrive) integration + full-account portable backup
in section 7. Updated exec summary, "where Diagramatix wins" (added M365 +
governed naming + portable backup) and positioning. Fixed stale schema
v1.15 -> v1.25 references. Regenerated the docx.

Co-Authored-By: Claude Opus 4.8 <noreply@anthropic.com>
</commit_message>
<xml_diff>
--- a/competitors/diagramatix-vs-signavio-aris-primebpm.docx
+++ b/competitors/diagramatix-vs-signavio-aris-primebpm.docx
@@ -20,7 +20,7 @@
           <w:i/>
           <w:iCs/>
         </w:rPr>
-        <w:t xml:space="preserve">Compiled: June 2026. Diagramatix data from the current codebase (export schema v1.25; BPMN + 6 other diagram types + Collaboration &amp; Review + a built-in discrete-event</w:t>
+        <w:t xml:space="preserve">Compiled: June 2026. Diagramatix data from the current codebase (export schema v1.25; BPMN + 6 other diagram types, plus a built-in discrete-event</w:t>
       </w:r>
       <w:r>
         <w:rPr>
@@ -37,6 +37,105 @@
           <w:iCs/>
         </w:rPr>
         <w:t xml:space="preserve">Process Simulator</w:t>
+      </w:r>
+      <w:r>
+        <w:rPr>
+          <w:i/>
+          <w:iCs/>
+        </w:rPr>
+        <w:t xml:space="preserve">, a</w:t>
+      </w:r>
+      <w:r>
+        <w:rPr>
+          <w:i/>
+          <w:iCs/>
+        </w:rPr>
+        <w:t xml:space="preserve"> </w:t>
+      </w:r>
+      <w:r>
+        <w:rPr>
+          <w:b/>
+          <w:bCs/>
+          <w:i/>
+          <w:iCs/>
+        </w:rPr>
+        <w:t xml:space="preserve">publishing &amp; review lifecycle</w:t>
+      </w:r>
+      <w:r>
+        <w:rPr>
+          <w:i/>
+          <w:iCs/>
+        </w:rPr>
+        <w:t xml:space="preserve">,</w:t>
+      </w:r>
+      <w:r>
+        <w:rPr>
+          <w:i/>
+          <w:iCs/>
+        </w:rPr>
+        <w:t xml:space="preserve"> </w:t>
+      </w:r>
+      <w:r>
+        <w:rPr>
+          <w:b/>
+          <w:bCs/>
+          <w:i/>
+          <w:iCs/>
+        </w:rPr>
+        <w:t xml:space="preserve">Microsoft 365 (SharePoint/OneDrive) integration</w:t>
+      </w:r>
+      <w:r>
+        <w:rPr>
+          <w:i/>
+          <w:iCs/>
+        </w:rPr>
+        <w:t xml:space="preserve">,</w:t>
+      </w:r>
+      <w:r>
+        <w:rPr>
+          <w:i/>
+          <w:iCs/>
+        </w:rPr>
+        <w:t xml:space="preserve"> </w:t>
+      </w:r>
+      <w:r>
+        <w:rPr>
+          <w:b/>
+          <w:bCs/>
+          <w:i/>
+          <w:iCs/>
+        </w:rPr>
+        <w:t xml:space="preserve">governed pool/lane naming</w:t>
+      </w:r>
+      <w:r>
+        <w:rPr>
+          <w:i/>
+          <w:iCs/>
+        </w:rPr>
+        <w:t xml:space="preserve"> </w:t>
+      </w:r>
+      <w:r>
+        <w:rPr>
+          <w:i/>
+          <w:iCs/>
+        </w:rPr>
+        <w:t xml:space="preserve">and</w:t>
+      </w:r>
+      <w:r>
+        <w:rPr>
+          <w:i/>
+          <w:iCs/>
+        </w:rPr>
+        <w:t xml:space="preserve"> </w:t>
+      </w:r>
+      <w:r>
+        <w:rPr>
+          <w:b/>
+          <w:bCs/>
+          <w:i/>
+          <w:iCs/>
+        </w:rPr>
+        <w:t xml:space="preserve">role-based sharing / org admin</w:t>
       </w:r>
       <w:r>
         <w:rPr>
@@ -538,7 +637,7 @@
         <w:t xml:space="preserve"> </w:t>
       </w:r>
       <w:r>
-        <w:t xml:space="preserve">Operator, a plain-language cost/FTE verdict, BPSim import/export, all self-hosted). The three enterprise suites still each win on what</w:t>
+        <w:t xml:space="preserve">Operator, a plain-language cost/FTE verdict, BPSim import/export, all self-hosted). Alongside it, Diagramatix has filled in the</w:t>
       </w:r>
       <w:r>
         <w:t xml:space="preserve"> </w:t>
@@ -548,13 +647,99 @@
           <w:i/>
           <w:iCs/>
         </w:rPr>
+        <w:t xml:space="preserve">operational</w:t>
+      </w:r>
+      <w:r>
+        <w:t xml:space="preserve"> </w:t>
+      </w:r>
+      <w:r>
+        <w:t xml:space="preserve">layer that small-and-mid teams need — a</w:t>
+      </w:r>
+      <w:r>
+        <w:t xml:space="preserve"> </w:t>
+      </w:r>
+      <w:r>
+        <w:rPr>
+          <w:b/>
+          <w:bCs/>
+        </w:rPr>
+        <w:t xml:space="preserve">publishing &amp; review lifecycle</w:t>
+      </w:r>
+      <w:r>
+        <w:t xml:space="preserve">,</w:t>
+      </w:r>
+      <w:r>
+        <w:t xml:space="preserve"> </w:t>
+      </w:r>
+      <w:r>
+        <w:rPr>
+          <w:b/>
+          <w:bCs/>
+        </w:rPr>
+        <w:t xml:space="preserve">role-based project sharing + an org-admin tier</w:t>
+      </w:r>
+      <w:r>
+        <w:t xml:space="preserve">,</w:t>
+      </w:r>
+      <w:r>
+        <w:t xml:space="preserve"> </w:t>
+      </w:r>
+      <w:r>
+        <w:rPr>
+          <w:b/>
+          <w:bCs/>
+        </w:rPr>
+        <w:t xml:space="preserve">governed pool/lane naming</w:t>
+      </w:r>
+      <w:r>
+        <w:t xml:space="preserve"> </w:t>
+      </w:r>
+      <w:r>
+        <w:t xml:space="preserve">(its lightweight answer to an enterprise glossary), and</w:t>
+      </w:r>
+      <w:r>
+        <w:t xml:space="preserve"> </w:t>
+      </w:r>
+      <w:r>
+        <w:rPr>
+          <w:b/>
+          <w:bCs/>
+        </w:rPr>
+        <w:t xml:space="preserve">Microsoft 365 (SharePoint/OneDrive)</w:t>
+      </w:r>
+      <w:r>
+        <w:t xml:space="preserve"> </w:t>
+      </w:r>
+      <w:r>
+        <w:t xml:space="preserve">integration — so it’s no longer</w:t>
+      </w:r>
+      <w:r>
+        <w:t xml:space="preserve"> </w:t>
+      </w:r>
+      <w:r>
+        <w:t xml:space="preserve">“just an editor.”</w:t>
+      </w:r>
+      <w:r>
+        <w:t xml:space="preserve"> </w:t>
+      </w:r>
+      <w:r>
+        <w:t xml:space="preserve">The three enterprise suites still each win on what</w:t>
+      </w:r>
+      <w:r>
+        <w:t xml:space="preserve"> </w:t>
+      </w:r>
+      <w:r>
+        <w:rPr>
+          <w:i/>
+          <w:iCs/>
+        </w:rPr>
         <w:t xml:space="preserve">surrounds</w:t>
       </w:r>
       <w:r>
         <w:t xml:space="preserve"> </w:t>
       </w:r>
       <w:r>
-        <w:t xml:space="preserve">modelling — Signavio on the SAP ecosystem + mining, ARIS on EA breadth + EPC + repository governance + a deeper, more mature simulation engine, PRIME BPM on built-in process-improvement analytics. None of the three is self-hostable per-seat the way Diagramatix is. Process</w:t>
+        <w:t xml:space="preserve">modelling at scale — Signavio on the SAP ecosystem + mining, ARIS on EA breadth + EPC + repository governance + a deeper, more mature simulation engine, PRIME BPM on built-in process-improvement analytics. None of the three is self-hostable per-seat the way Diagramatix is. Process</w:t>
       </w:r>
       <w:r>
         <w:t xml:space="preserve"> </w:t>
@@ -2869,6 +3054,111 @@
           </w:p>
         </w:tc>
       </w:tr>
+      <w:tr>
+        <w:tc>
+          <w:tcPr/>
+          <w:p>
+            <w:pPr>
+              <w:pStyle w:val="Compact"/>
+            </w:pPr>
+            <w:r>
+              <w:t xml:space="preserve">Glossary /</w:t>
+            </w:r>
+            <w:r>
+              <w:t xml:space="preserve"> </w:t>
+            </w:r>
+            <w:r>
+              <w:rPr>
+                <w:b/>
+                <w:bCs/>
+              </w:rPr>
+              <w:t xml:space="preserve">governed naming</w:t>
+            </w:r>
+            <w:r>
+              <w:t xml:space="preserve"> </w:t>
+            </w:r>
+            <w:r>
+              <w:t xml:space="preserve">(reusable term dictionary)</w:t>
+            </w:r>
+          </w:p>
+        </w:tc>
+        <w:tc>
+          <w:tcPr/>
+          <w:p>
+            <w:pPr>
+              <w:pStyle w:val="Compact"/>
+            </w:pPr>
+            <w:r>
+              <w:t xml:space="preserve">✅</w:t>
+            </w:r>
+            <w:r>
+              <w:t xml:space="preserve"> </w:t>
+            </w:r>
+            <w:r>
+              <w:rPr>
+                <w:b/>
+                <w:bCs/>
+              </w:rPr>
+              <w:t xml:space="preserve">Entity Lists</w:t>
+            </w:r>
+            <w:r>
+              <w:t xml:space="preserve"> </w:t>
+            </w:r>
+            <w:r>
+              <w:t xml:space="preserve">— pools/lanes named from a maintained Org → Unit → Team → Role hierarchy + External-Participant + IT-Systems lists (org-master → editable project copy)</w:t>
+            </w:r>
+          </w:p>
+        </w:tc>
+        <w:tc>
+          <w:tcPr/>
+          <w:p>
+            <w:pPr>
+              <w:pStyle w:val="Compact"/>
+            </w:pPr>
+            <w:r>
+              <w:t xml:space="preserve">✅</w:t>
+            </w:r>
+            <w:r>
+              <w:t xml:space="preserve"> </w:t>
+            </w:r>
+            <w:r>
+              <w:rPr>
+                <w:b/>
+                <w:bCs/>
+              </w:rPr>
+              <w:t xml:space="preserve">Dictionary</w:t>
+            </w:r>
+            <w:r>
+              <w:t xml:space="preserve"> </w:t>
+            </w:r>
+            <w:r>
+              <w:t xml:space="preserve">(central glossary of reusable terms)</w:t>
+            </w:r>
+          </w:p>
+        </w:tc>
+        <w:tc>
+          <w:tcPr/>
+          <w:p>
+            <w:pPr>
+              <w:pStyle w:val="Compact"/>
+            </w:pPr>
+            <w:r>
+              <w:t xml:space="preserve">✅ Repository-level naming governance</w:t>
+            </w:r>
+          </w:p>
+        </w:tc>
+        <w:tc>
+          <w:tcPr/>
+          <w:p>
+            <w:pPr>
+              <w:pStyle w:val="Compact"/>
+            </w:pPr>
+            <w:r>
+              <w:t xml:space="preserve">Partial</w:t>
+            </w:r>
+          </w:p>
+        </w:tc>
+      </w:tr>
     </w:tbl>
     <w:p>
       <w:pPr>
@@ -2885,7 +3175,23 @@
         <w:t xml:space="preserve"> </w:t>
       </w:r>
       <w:r>
-        <w:t xml:space="preserve">The three suites have deeper formal notation coverage (CMMN/DMN; EPC for ARIS) and more formal validation. Diagramatix covers the BPMN you’ll use day-to-day and pairs it with layout/AI features the others don’t.</w:t>
+        <w:t xml:space="preserve">The three suites have deeper formal notation coverage (CMMN/DMN; EPC for ARIS) and more formal validation. Diagramatix covers the BPMN you’ll use day-to-day, adds</w:t>
+      </w:r>
+      <w:r>
+        <w:t xml:space="preserve"> </w:t>
+      </w:r>
+      <w:r>
+        <w:rPr>
+          <w:b/>
+          <w:bCs/>
+        </w:rPr>
+        <w:t xml:space="preserve">governed pool/lane naming</w:t>
+      </w:r>
+      <w:r>
+        <w:t xml:space="preserve"> </w:t>
+      </w:r>
+      <w:r>
+        <w:t xml:space="preserve">(Entity Lists — its lightweight take on Signavio’s Dictionary / an ARIS repository), and pairs it all with layout/AI features the others don’t.</w:t>
       </w:r>
     </w:p>
     <w:p>
@@ -3371,13 +3677,13 @@
       </w:r>
     </w:p>
     <w:bookmarkEnd w:id="14"/>
-    <w:bookmarkStart w:id="15" w:name="collaboration-review"/>
+    <w:bookmarkStart w:id="15" w:name="collaboration-review-access"/>
     <w:p>
       <w:pPr>
         <w:pStyle w:val="Heading2"/>
       </w:pPr>
       <w:r>
-        <w:t xml:space="preserve">5. Collaboration &amp; Review</w:t>
+        <w:t xml:space="preserve">5. Collaboration, Review &amp; Access</w:t>
       </w:r>
     </w:p>
     <w:tbl>
@@ -3519,6 +3825,168 @@
               <w:pStyle w:val="Compact"/>
             </w:pPr>
             <w:r>
+              <w:rPr>
+                <w:b/>
+                <w:bCs/>
+              </w:rPr>
+              <w:t xml:space="preserve">Role-based project sharing</w:t>
+            </w:r>
+            <w:r>
+              <w:t xml:space="preserve"> </w:t>
+            </w:r>
+            <w:r>
+              <w:t xml:space="preserve">(View / Edit, per project)</w:t>
+            </w:r>
+          </w:p>
+        </w:tc>
+        <w:tc>
+          <w:tcPr/>
+          <w:p>
+            <w:pPr>
+              <w:pStyle w:val="Compact"/>
+            </w:pPr>
+            <w:r>
+              <w:t xml:space="preserve">✅ owner grants View/Edit by name/email; per-diagram</w:t>
+            </w:r>
+            <w:r>
+              <w:t xml:space="preserve"> </w:t>
+            </w:r>
+            <w:r>
+              <w:t xml:space="preserve">“Diagram Owner”</w:t>
+            </w:r>
+            <w:r>
+              <w:t xml:space="preserve"> </w:t>
+            </w:r>
+            <w:r>
+              <w:t xml:space="preserve">accountability</w:t>
+            </w:r>
+          </w:p>
+        </w:tc>
+        <w:tc>
+          <w:tcPr/>
+          <w:p>
+            <w:pPr>
+              <w:pStyle w:val="Compact"/>
+            </w:pPr>
+            <w:r>
+              <w:t xml:space="preserve">✅ enterprise RBAC</w:t>
+            </w:r>
+          </w:p>
+        </w:tc>
+        <w:tc>
+          <w:tcPr/>
+          <w:p>
+            <w:pPr>
+              <w:pStyle w:val="Compact"/>
+            </w:pPr>
+            <w:r>
+              <w:t xml:space="preserve">✅ enterprise RBAC</w:t>
+            </w:r>
+          </w:p>
+        </w:tc>
+        <w:tc>
+          <w:tcPr/>
+          <w:p>
+            <w:pPr>
+              <w:pStyle w:val="Compact"/>
+            </w:pPr>
+            <w:r>
+              <w:t xml:space="preserve">✅</w:t>
+            </w:r>
+          </w:p>
+        </w:tc>
+      </w:tr>
+      <w:tr>
+        <w:tc>
+          <w:tcPr/>
+          <w:p>
+            <w:pPr>
+              <w:pStyle w:val="Compact"/>
+            </w:pPr>
+            <w:r>
+              <w:rPr>
+                <w:b/>
+                <w:bCs/>
+              </w:rPr>
+              <w:t xml:space="preserve">Organisation admin</w:t>
+            </w:r>
+            <w:r>
+              <w:t xml:space="preserve"> </w:t>
+            </w:r>
+            <w:r>
+              <w:t xml:space="preserve">+ sharing policy</w:t>
+            </w:r>
+          </w:p>
+        </w:tc>
+        <w:tc>
+          <w:tcPr/>
+          <w:p>
+            <w:pPr>
+              <w:pStyle w:val="Compact"/>
+            </w:pPr>
+            <w:r>
+              <w:t xml:space="preserve">✅</w:t>
+            </w:r>
+            <w:r>
+              <w:t xml:space="preserve"> </w:t>
+            </w:r>
+            <w:r>
+              <w:rPr>
+                <w:b/>
+                <w:bCs/>
+              </w:rPr>
+              <w:t xml:space="preserve">OrgAdmin role</w:t>
+            </w:r>
+            <w:r>
+              <w:t xml:space="preserve"> </w:t>
+            </w:r>
+            <w:r>
+              <w:t xml:space="preserve">with share oversight, per-org cross-org-sharing toggle, and silent admin membership</w:t>
+            </w:r>
+          </w:p>
+        </w:tc>
+        <w:tc>
+          <w:tcPr/>
+          <w:p>
+            <w:pPr>
+              <w:pStyle w:val="Compact"/>
+            </w:pPr>
+            <w:r>
+              <w:t xml:space="preserve">✅ enterprise admin/governance</w:t>
+            </w:r>
+          </w:p>
+        </w:tc>
+        <w:tc>
+          <w:tcPr/>
+          <w:p>
+            <w:pPr>
+              <w:pStyle w:val="Compact"/>
+            </w:pPr>
+            <w:r>
+              <w:t xml:space="preserve">✅ enterprise admin/governance</w:t>
+            </w:r>
+          </w:p>
+        </w:tc>
+        <w:tc>
+          <w:tcPr/>
+          <w:p>
+            <w:pPr>
+              <w:pStyle w:val="Compact"/>
+            </w:pPr>
+            <w:r>
+              <w:t xml:space="preserve">✅</w:t>
+            </w:r>
+          </w:p>
+        </w:tc>
+      </w:tr>
+      <w:tr>
+        <w:tc>
+          <w:tcPr/>
+          <w:p>
+            <w:pPr>
+              <w:pStyle w:val="Compact"/>
+            </w:pPr>
+            <w:r>
               <w:t xml:space="preserve">Send a diagram for review with objective + due date</w:t>
             </w:r>
           </w:p>
@@ -4117,10 +4585,23 @@
           <w:b/>
           <w:bCs/>
         </w:rPr>
-        <w:t xml:space="preserve">mid-tier, not basic, on review + publishing</w:t>
-      </w:r>
-      <w:r>
-        <w:t xml:space="preserve">: a genuine review loop (send → comment → approve/decline → re-submit → finish)</w:t>
+        <w:t xml:space="preserve">mid-tier, not basic, on collaboration / governance</w:t>
+      </w:r>
+      <w:r>
+        <w:t xml:space="preserve">: a genuine review loop (send → comment → approve/decline → re-submit → finish), a real publishing lifecycle (draft→published, immutable/superseded versions,</w:t>
+      </w:r>
+      <w:r>
+        <w:t xml:space="preserve"> </w:t>
+      </w:r>
+      <w:r>
+        <w:rPr>
+          <w:b/>
+          <w:bCs/>
+        </w:rPr>
+        <w:t xml:space="preserve">publication bundles to business-user audiences with a read-only viewer</w:t>
+      </w:r>
+      <w:r>
+        <w:t xml:space="preserve">, scheduled re-review reminders),</w:t>
       </w:r>
       <w:r>
         <w:t xml:space="preserve"> </w:t>
@@ -4136,33 +4617,20 @@
         <w:t xml:space="preserve"> </w:t>
       </w:r>
       <w:r>
-        <w:t xml:space="preserve">a real publishing lifecycle — draft→published, immutable/superseded versions,</w:t>
-      </w:r>
-      <w:r>
-        <w:t xml:space="preserve"> </w:t>
-      </w:r>
-      <w:r>
-        <w:rPr>
-          <w:b/>
-          <w:bCs/>
-        </w:rPr>
-        <w:t xml:space="preserve">publication bundles published to business-user audiences (invite-by-email) with a read-only viewer</w:t>
-      </w:r>
-      <w:r>
-        <w:t xml:space="preserve">, and</w:t>
-      </w:r>
-      <w:r>
-        <w:t xml:space="preserve"> </w:t>
-      </w:r>
-      <w:r>
-        <w:rPr>
-          <w:b/>
-          <w:bCs/>
-        </w:rPr>
-        <w:t xml:space="preserve">scheduled re-review reminders</w:t>
-      </w:r>
-      <w:r>
-        <w:t xml:space="preserve">. That closes most of the small-team gap versus the suites. They still win on</w:t>
+        <w:t xml:space="preserve">an access layer —</w:t>
+      </w:r>
+      <w:r>
+        <w:t xml:space="preserve"> </w:t>
+      </w:r>
+      <w:r>
+        <w:rPr>
+          <w:b/>
+          <w:bCs/>
+        </w:rPr>
+        <w:t xml:space="preserve">role-based project sharing plus an OrgAdmin tier with share oversight and per-org sharing policy</w:t>
+      </w:r>
+      <w:r>
+        <w:t xml:space="preserve">. That closes most of the small-and-mid-team gap. The suites still win on</w:t>
       </w:r>
       <w:r>
         <w:t xml:space="preserve"> </w:t>
@@ -6070,7 +6538,7 @@
               <w:pStyle w:val="Compact"/>
             </w:pPr>
             <w:r>
-              <w:t xml:space="preserve">✅ (versioned XSD, schema v1.15)</w:t>
+              <w:t xml:space="preserve">✅ (versioned XSD, schema v1.25)</w:t>
             </w:r>
           </w:p>
         </w:tc>
@@ -6161,6 +6629,189 @@
             </w:pPr>
             <w:r>
               <w:t xml:space="preserve">❌</w:t>
+            </w:r>
+          </w:p>
+        </w:tc>
+      </w:tr>
+      <w:tr>
+        <w:tc>
+          <w:tcPr/>
+          <w:p>
+            <w:pPr>
+              <w:pStyle w:val="Compact"/>
+            </w:pPr>
+            <w:r>
+              <w:rPr>
+                <w:b/>
+                <w:bCs/>
+              </w:rPr>
+              <w:t xml:space="preserve">Microsoft 365 (SharePoint / OneDrive)</w:t>
+            </w:r>
+            <w:r>
+              <w:t xml:space="preserve"> </w:t>
+            </w:r>
+            <w:r>
+              <w:t xml:space="preserve">integration</w:t>
+            </w:r>
+          </w:p>
+        </w:tc>
+        <w:tc>
+          <w:tcPr/>
+          <w:p>
+            <w:pPr>
+              <w:pStyle w:val="Compact"/>
+            </w:pPr>
+            <w:r>
+              <w:t xml:space="preserve">✅</w:t>
+            </w:r>
+            <w:r>
+              <w:t xml:space="preserve"> </w:t>
+            </w:r>
+            <w:r>
+              <w:rPr>
+                <w:b/>
+                <w:bCs/>
+              </w:rPr>
+              <w:t xml:space="preserve">Sign in with Microsoft; save / open diagram files in SharePoint or OneDrive; link Data Objects/Stores to live documents with an embedded preview</w:t>
+            </w:r>
+          </w:p>
+        </w:tc>
+        <w:tc>
+          <w:tcPr/>
+          <w:p>
+            <w:pPr>
+              <w:pStyle w:val="Compact"/>
+            </w:pPr>
+            <w:r>
+              <w:t xml:space="preserve">Via SAP + MS ecosystem (varies)</w:t>
+            </w:r>
+          </w:p>
+        </w:tc>
+        <w:tc>
+          <w:tcPr/>
+          <w:p>
+            <w:pPr>
+              <w:pStyle w:val="Compact"/>
+            </w:pPr>
+            <w:r>
+              <w:t xml:space="preserve">Via integrations</w:t>
+            </w:r>
+          </w:p>
+        </w:tc>
+        <w:tc>
+          <w:tcPr/>
+          <w:p>
+            <w:pPr>
+              <w:pStyle w:val="Compact"/>
+            </w:pPr>
+            <w:r>
+              <w:t xml:space="preserve">Varies</w:t>
+            </w:r>
+          </w:p>
+        </w:tc>
+      </w:tr>
+      <w:tr>
+        <w:tc>
+          <w:tcPr/>
+          <w:p>
+            <w:pPr>
+              <w:pStyle w:val="Compact"/>
+            </w:pPr>
+            <w:r>
+              <w:rPr>
+                <w:b/>
+                <w:bCs/>
+              </w:rPr>
+              <w:t xml:space="preserve">Full-account portable backup / restore</w:t>
+            </w:r>
+          </w:p>
+        </w:tc>
+        <w:tc>
+          <w:tcPr/>
+          <w:p>
+            <w:pPr>
+              <w:pStyle w:val="Compact"/>
+            </w:pPr>
+            <w:r>
+              <w:t xml:space="preserve">✅</w:t>
+            </w:r>
+            <w:r>
+              <w:t xml:space="preserve"> </w:t>
+            </w:r>
+            <w:r>
+              <w:rPr>
+                <w:b/>
+                <w:bCs/>
+              </w:rPr>
+              <w:t xml:space="preserve">one</w:t>
+            </w:r>
+            <w:r>
+              <w:rPr>
+                <w:b/>
+                <w:bCs/>
+              </w:rPr>
+              <w:t xml:space="preserve"> </w:t>
+            </w:r>
+            <w:r>
+              <w:rPr>
+                <w:rStyle w:val="VerbatimChar"/>
+                <w:b/>
+                <w:bCs/>
+              </w:rPr>
+              <w:t xml:space="preserve">.diag</w:t>
+            </w:r>
+            <w:r>
+              <w:rPr>
+                <w:b/>
+                <w:bCs/>
+              </w:rPr>
+              <w:t xml:space="preserve"> </w:t>
+            </w:r>
+            <w:r>
+              <w:rPr>
+                <w:b/>
+                <w:bCs/>
+              </w:rPr>
+              <w:t xml:space="preserve">file = every project, diagram, template + prefs; restore anywhere</w:t>
+            </w:r>
+            <w:r>
+              <w:t xml:space="preserve"> </w:t>
+            </w:r>
+            <w:r>
+              <w:t xml:space="preserve">(with live-progress guided backups)</w:t>
+            </w:r>
+          </w:p>
+        </w:tc>
+        <w:tc>
+          <w:tcPr/>
+          <w:p>
+            <w:pPr>
+              <w:pStyle w:val="Compact"/>
+            </w:pPr>
+            <w:r>
+              <w:t xml:space="preserve">❌ (SaaS-managed)</w:t>
+            </w:r>
+          </w:p>
+        </w:tc>
+        <w:tc>
+          <w:tcPr/>
+          <w:p>
+            <w:pPr>
+              <w:pStyle w:val="Compact"/>
+            </w:pPr>
+            <w:r>
+              <w:t xml:space="preserve">Enterprise export</w:t>
+            </w:r>
+          </w:p>
+        </w:tc>
+        <w:tc>
+          <w:tcPr/>
+          <w:p>
+            <w:pPr>
+              <w:pStyle w:val="Compact"/>
+            </w:pPr>
+            <w:r>
+              <w:t xml:space="preserve">❌ (SaaS-managed)</w:t>
             </w:r>
           </w:p>
         </w:tc>
@@ -6490,7 +7141,38 @@
         <w:t xml:space="preserve">Self-hosted, no ecosystem lock-in</w:t>
       </w:r>
       <w:r>
-        <w:t xml:space="preserve">, per-seat pricing.</w:t>
+        <w:t xml:space="preserve">, per-seat pricing — with a</w:t>
+      </w:r>
+      <w:r>
+        <w:t xml:space="preserve"> </w:t>
+      </w:r>
+      <w:r>
+        <w:rPr>
+          <w:b/>
+          <w:bCs/>
+        </w:rPr>
+        <w:t xml:space="preserve">full-account portable backup</w:t>
+      </w:r>
+      <w:r>
+        <w:t xml:space="preserve"> </w:t>
+      </w:r>
+      <w:r>
+        <w:t xml:space="preserve">(one</w:t>
+      </w:r>
+      <w:r>
+        <w:t xml:space="preserve"> </w:t>
+      </w:r>
+      <w:r>
+        <w:rPr>
+          <w:rStyle w:val="VerbatimChar"/>
+        </w:rPr>
+        <w:t xml:space="preserve">.diag</w:t>
+      </w:r>
+      <w:r>
+        <w:t xml:space="preserve"> </w:t>
+      </w:r>
+      <w:r>
+        <w:t xml:space="preserve">file, restore anywhere) the SaaS suites can’t match.</w:t>
       </w:r>
     </w:p>
     <w:p>
@@ -6544,29 +7226,70 @@
           <w:b/>
           <w:bCs/>
         </w:rPr>
-        <w:t xml:space="preserve">Review + publishing lifecycle</w:t>
-      </w:r>
-      <w:r>
-        <w:t xml:space="preserve"> </w:t>
-      </w:r>
-      <w:r>
-        <w:t xml:space="preserve">— send-for-review rounds</w:t>
-      </w:r>
-      <w:r>
-        <w:t xml:space="preserve"> </w:t>
-      </w:r>
-      <w:r>
-        <w:rPr>
-          <w:i/>
-          <w:iCs/>
-        </w:rPr>
-        <w:t xml:space="preserve">plus</w:t>
-      </w:r>
-      <w:r>
-        <w:t xml:space="preserve"> </w:t>
-      </w:r>
-      <w:r>
-        <w:t xml:space="preserve">draft→published versioning, publication bundles to a business-user audience (invite-by-email + read-only viewer), and scheduled re-review reminders.</w:t>
+        <w:t xml:space="preserve">Collaboration, publishing &amp; access lifecycle</w:t>
+      </w:r>
+      <w:r>
+        <w:t xml:space="preserve"> </w:t>
+      </w:r>
+      <w:r>
+        <w:t xml:space="preserve">— send-for-review rounds, draft→published versioning, publication bundles to a business-user audience (invite-by-email + read-only viewer), scheduled re-review reminders,</w:t>
+      </w:r>
+      <w:r>
+        <w:t xml:space="preserve"> </w:t>
+      </w:r>
+      <w:r>
+        <w:rPr>
+          <w:b/>
+          <w:bCs/>
+        </w:rPr>
+        <w:t xml:space="preserve">role-based sharing and an OrgAdmin tier</w:t>
+      </w:r>
+      <w:r>
+        <w:t xml:space="preserve">.</w:t>
+      </w:r>
+    </w:p>
+    <w:p>
+      <w:pPr>
+        <w:pStyle w:val="Compact"/>
+        <w:numPr>
+          <w:ilvl w:val="0"/>
+          <w:numId w:val="1002"/>
+        </w:numPr>
+      </w:pPr>
+      <w:r>
+        <w:rPr>
+          <w:b/>
+          <w:bCs/>
+        </w:rPr>
+        <w:t xml:space="preserve">Microsoft 365 integration</w:t>
+      </w:r>
+      <w:r>
+        <w:t xml:space="preserve"> </w:t>
+      </w:r>
+      <w:r>
+        <w:t xml:space="preserve">— Microsoft sign-in plus SharePoint/OneDrive save-open and Data-Object file links with embedded preview.</w:t>
+      </w:r>
+    </w:p>
+    <w:p>
+      <w:pPr>
+        <w:pStyle w:val="Compact"/>
+        <w:numPr>
+          <w:ilvl w:val="0"/>
+          <w:numId w:val="1002"/>
+        </w:numPr>
+      </w:pPr>
+      <w:r>
+        <w:rPr>
+          <w:b/>
+          <w:bCs/>
+        </w:rPr>
+        <w:t xml:space="preserve">Governed naming</w:t>
+      </w:r>
+      <w:r>
+        <w:t xml:space="preserve"> </w:t>
+      </w:r>
+      <w:r>
+        <w:t xml:space="preserve">— consistent pool/lane names drawn from a maintained Org/Participant/IT-Systems library (Entity Lists), adopted per project.</w:t>
       </w:r>
     </w:p>
     <w:bookmarkEnd w:id="19"/>
@@ -6823,6 +7546,19 @@
         <w:t xml:space="preserve">BPSim</w:t>
       </w:r>
       <w:r>
+        <w:t xml:space="preserve">; saves to</w:t>
+      </w:r>
+      <w:r>
+        <w:t xml:space="preserve"> </w:t>
+      </w:r>
+      <w:r>
+        <w:rPr>
+          <w:b/>
+          <w:bCs/>
+        </w:rPr>
+        <w:t xml:space="preserve">SharePoint/OneDrive</w:t>
+      </w:r>
+      <w:r>
         <w:t xml:space="preserve">;</w:t>
       </w:r>
       <w:r>
@@ -6848,7 +7584,61 @@
         </w:numPr>
       </w:pPr>
       <w:r>
-        <w:t xml:space="preserve">“All the authoring, AI, review</w:t>
+        <w:t xml:space="preserve">“</w:t>
+      </w:r>
+      <w:r>
+        <w:rPr>
+          <w:b/>
+          <w:bCs/>
+        </w:rPr>
+        <w:t xml:space="preserve">Governed naming</w:t>
+      </w:r>
+      <w:r>
+        <w:t xml:space="preserve">,</w:t>
+      </w:r>
+      <w:r>
+        <w:t xml:space="preserve"> </w:t>
+      </w:r>
+      <w:r>
+        <w:rPr>
+          <w:b/>
+          <w:bCs/>
+        </w:rPr>
+        <w:t xml:space="preserve">role-based sharing</w:t>
+      </w:r>
+      <w:r>
+        <w:t xml:space="preserve"> </w:t>
+      </w:r>
+      <w:r>
+        <w:t xml:space="preserve">and an</w:t>
+      </w:r>
+      <w:r>
+        <w:t xml:space="preserve"> </w:t>
+      </w:r>
+      <w:r>
+        <w:rPr>
+          <w:b/>
+          <w:bCs/>
+        </w:rPr>
+        <w:t xml:space="preserve">org-admin tier</w:t>
+      </w:r>
+      <w:r>
+        <w:t xml:space="preserve"> </w:t>
+      </w:r>
+      <w:r>
+        <w:t xml:space="preserve">— the operational layer, not just an editor.”</w:t>
+      </w:r>
+    </w:p>
+    <w:p>
+      <w:pPr>
+        <w:pStyle w:val="Compact"/>
+        <w:numPr>
+          <w:ilvl w:val="0"/>
+          <w:numId w:val="1004"/>
+        </w:numPr>
+      </w:pPr>
+      <w:r>
+        <w:t xml:space="preserve">“All the authoring, AI, review, publishing</w:t>
       </w:r>
       <w:r>
         <w:t xml:space="preserve"> </w:t>
@@ -6948,7 +7738,7 @@
         <w:t xml:space="preserve"> </w:t>
       </w:r>
       <w:r>
-        <w:t xml:space="preserve">(current branch, May 2026; export schema v1.15).</w:t>
+        <w:t xml:space="preserve">(current branch, June 2026; export schema v1.25; 26 published feature-catalog entries).</w:t>
       </w:r>
     </w:p>
     <w:p>

</xml_diff>

<commit_message>
feat(features+docs): Text-to-Diagram (all notations) + Image-to-Diagram
Two distinctive AI capabilities were under-represented. Added catalog entries:
- "Text-to-Diagram for Every Notation" — AI generation isn't BPMN-only; it spans
  Value Chain, Process Context, State Machine, Domain, Context, ArchiMate too.
- "Image to Diagram" — attach a sketch/screenshot/competitor flowchart; vision +
  OCR reverse-engineer it into an editable diagram, translating a plain
  flowchart image INTO BPMN (Flowchart + BPMN).
Regenerated sync-features.sql (28 features) + applied to local (28 published).

Competitor analysis (md + docx): §2 gains image to the input-modalities row, a
dedicated image→diagram row (Diagramatix only), and a sharper "text → 7
notations" framing; prose, AI verdict and the #1 win now call out the breadth +
image advantage vs BPMN-only Signavio/PRIME and BPMN+EPC ARIS.

Co-Authored-By: Claude Opus 4.8 <noreply@anthropic.com>
</commit_message>
<xml_diff>
--- a/competitors/diagramatix-vs-signavio-aris-primebpm.docx
+++ b/competitors/diagramatix-vs-signavio-aris-primebpm.docx
@@ -1005,18 +1005,57 @@
               <w:pStyle w:val="Compact"/>
             </w:pPr>
             <w:r>
-              <w:t xml:space="preserve">BPMN (2-phase) + one-shot for State Machine, Domain, Context, Process Context, Value Chain</w:t>
-            </w:r>
-          </w:p>
-        </w:tc>
-        <w:tc>
-          <w:tcPr/>
-          <w:p>
-            <w:pPr>
-              <w:pStyle w:val="Compact"/>
-            </w:pPr>
-            <w:r>
-              <w:t xml:space="preserve">BPMN</w:t>
+              <w:t xml:space="preserve">✅</w:t>
+            </w:r>
+            <w:r>
+              <w:t xml:space="preserve"> </w:t>
+            </w:r>
+            <w:r>
+              <w:rPr>
+                <w:b/>
+                <w:bCs/>
+              </w:rPr>
+              <w:t xml:space="preserve">Text → 7 notations</w:t>
+            </w:r>
+            <w:r>
+              <w:t xml:space="preserve">: BPMN (2-phase) + one-shot State Machine, Domain, Context,</w:t>
+            </w:r>
+            <w:r>
+              <w:t xml:space="preserve"> </w:t>
+            </w:r>
+            <w:r>
+              <w:rPr>
+                <w:b/>
+                <w:bCs/>
+              </w:rPr>
+              <w:t xml:space="preserve">Process Context</w:t>
+            </w:r>
+            <w:r>
+              <w:t xml:space="preserve">,</w:t>
+            </w:r>
+            <w:r>
+              <w:t xml:space="preserve"> </w:t>
+            </w:r>
+            <w:r>
+              <w:rPr>
+                <w:b/>
+                <w:bCs/>
+              </w:rPr>
+              <w:t xml:space="preserve">Value Chain</w:t>
+            </w:r>
+            <w:r>
+              <w:t xml:space="preserve">, ArchiMate</w:t>
+            </w:r>
+          </w:p>
+        </w:tc>
+        <w:tc>
+          <w:tcPr/>
+          <w:p>
+            <w:pPr>
+              <w:pStyle w:val="Compact"/>
+            </w:pPr>
+            <w:r>
+              <w:t xml:space="preserve">BPMN only</w:t>
             </w:r>
           </w:p>
         </w:tc>
@@ -1033,16 +1072,22 @@
               </w:rPr>
               <w:t xml:space="preserve">EPC or BPMN</w:t>
             </w:r>
-          </w:p>
-        </w:tc>
-        <w:tc>
-          <w:tcPr/>
-          <w:p>
-            <w:pPr>
-              <w:pStyle w:val="Compact"/>
-            </w:pPr>
-            <w:r>
-              <w:t xml:space="preserve">BPMN-compliant maps</w:t>
+            <w:r>
+              <w:t xml:space="preserve"> </w:t>
+            </w:r>
+            <w:r>
+              <w:t xml:space="preserve">(2)</w:t>
+            </w:r>
+          </w:p>
+        </w:tc>
+        <w:tc>
+          <w:tcPr/>
+          <w:p>
+            <w:pPr>
+              <w:pStyle w:val="Compact"/>
+            </w:pPr>
+            <w:r>
+              <w:t xml:space="preserve">BPMN-compliant maps only</w:t>
             </w:r>
           </w:p>
         </w:tc>
@@ -1066,7 +1111,23 @@
               <w:pStyle w:val="Compact"/>
             </w:pPr>
             <w:r>
-              <w:t xml:space="preserve">PDF + text-file attachments fed into the prompt</w:t>
+              <w:t xml:space="preserve">PDF, text-file,</w:t>
+            </w:r>
+            <w:r>
+              <w:t xml:space="preserve"> </w:t>
+            </w:r>
+            <w:r>
+              <w:rPr>
+                <w:b/>
+                <w:bCs/>
+              </w:rPr>
+              <w:t xml:space="preserve">and image / screenshot</w:t>
+            </w:r>
+            <w:r>
+              <w:t xml:space="preserve"> </w:t>
+            </w:r>
+            <w:r>
+              <w:t xml:space="preserve">attachments fed into the prompt</w:t>
             </w:r>
           </w:p>
         </w:tc>
@@ -1104,6 +1165,113 @@
                 <w:bCs/>
               </w:rPr>
               <w:t xml:space="preserve">Excel, text, audio, video, even a conversation</w:t>
+            </w:r>
+          </w:p>
+        </w:tc>
+      </w:tr>
+      <w:tr>
+        <w:tc>
+          <w:tcPr/>
+          <w:p>
+            <w:pPr>
+              <w:pStyle w:val="Compact"/>
+            </w:pPr>
+            <w:r>
+              <w:rPr>
+                <w:b/>
+                <w:bCs/>
+              </w:rPr>
+              <w:t xml:space="preserve">Image / sketch → diagram</w:t>
+            </w:r>
+            <w:r>
+              <w:t xml:space="preserve"> </w:t>
+            </w:r>
+            <w:r>
+              <w:t xml:space="preserve">(reverse-engineer)</w:t>
+            </w:r>
+          </w:p>
+        </w:tc>
+        <w:tc>
+          <w:tcPr/>
+          <w:p>
+            <w:pPr>
+              <w:pStyle w:val="Compact"/>
+            </w:pPr>
+            <w:r>
+              <w:t xml:space="preserve">✅</w:t>
+            </w:r>
+            <w:r>
+              <w:t xml:space="preserve"> </w:t>
+            </w:r>
+            <w:r>
+              <w:rPr>
+                <w:b/>
+                <w:bCs/>
+              </w:rPr>
+              <w:t xml:space="preserve">Attach a picture — whiteboard sketch, screenshot, or someone else’s flowchart — and AI vision + OCR rebuild it as an editable diagram;</w:t>
+            </w:r>
+            <w:r>
+              <w:rPr>
+                <w:b/>
+                <w:bCs/>
+              </w:rPr>
+              <w:t xml:space="preserve"> </w:t>
+            </w:r>
+            <w:r>
+              <w:rPr>
+                <w:b/>
+                <w:bCs/>
+                <w:i/>
+                <w:iCs/>
+              </w:rPr>
+              <w:t xml:space="preserve">translates a plain flowchart image into BPMN</w:t>
+            </w:r>
+            <w:r>
+              <w:rPr>
+                <w:b/>
+                <w:bCs/>
+              </w:rPr>
+              <w:t xml:space="preserve"> </w:t>
+            </w:r>
+            <w:r>
+              <w:rPr>
+                <w:b/>
+                <w:bCs/>
+              </w:rPr>
+              <w:t xml:space="preserve">(Flowchart + BPMN)</w:t>
+            </w:r>
+          </w:p>
+        </w:tc>
+        <w:tc>
+          <w:tcPr/>
+          <w:p>
+            <w:pPr>
+              <w:pStyle w:val="Compact"/>
+            </w:pPr>
+            <w:r>
+              <w:t xml:space="preserve">—</w:t>
+            </w:r>
+          </w:p>
+        </w:tc>
+        <w:tc>
+          <w:tcPr/>
+          <w:p>
+            <w:pPr>
+              <w:pStyle w:val="Compact"/>
+            </w:pPr>
+            <w:r>
+              <w:t xml:space="preserve">—</w:t>
+            </w:r>
+          </w:p>
+        </w:tc>
+        <w:tc>
+          <w:tcPr/>
+          <w:p>
+            <w:pPr>
+              <w:pStyle w:val="Compact"/>
+            </w:pPr>
+            <w:r>
+              <w:t xml:space="preserve">— (audio/video/Excel capture, not image→BPMN)</w:t>
             </w:r>
           </w:p>
         </w:tc>
@@ -1878,7 +2046,84 @@
         <w:t xml:space="preserve"> </w:t>
       </w:r>
       <w:r>
-        <w:t xml:space="preserve">(enforced locally by the layout engine), so an organisation can encode its own conventions. Recent additions include first-class</w:t>
+        <w:t xml:space="preserve">(enforced locally by the layout engine), so an organisation can encode its own conventions. Two breadth advantages the others don’t match: AI generation spans</w:t>
+      </w:r>
+      <w:r>
+        <w:t xml:space="preserve"> </w:t>
+      </w:r>
+      <w:r>
+        <w:rPr>
+          <w:b/>
+          <w:bCs/>
+        </w:rPr>
+        <w:t xml:space="preserve">seven notations</w:t>
+      </w:r>
+      <w:r>
+        <w:t xml:space="preserve"> </w:t>
+      </w:r>
+      <w:r>
+        <w:t xml:space="preserve">— not just BPMN but</w:t>
+      </w:r>
+      <w:r>
+        <w:t xml:space="preserve"> </w:t>
+      </w:r>
+      <w:r>
+        <w:rPr>
+          <w:b/>
+          <w:bCs/>
+        </w:rPr>
+        <w:t xml:space="preserve">Value Chain, Process Context</w:t>
+      </w:r>
+      <w:r>
+        <w:t xml:space="preserve">, State Machine, Domain, Context and ArchiMate (Signavio and PRIME are BPMN-only; ARIS adds just EPC) — and a distinctive</w:t>
+      </w:r>
+      <w:r>
+        <w:t xml:space="preserve"> </w:t>
+      </w:r>
+      <w:r>
+        <w:rPr>
+          <w:b/>
+          <w:bCs/>
+        </w:rPr>
+        <w:t xml:space="preserve">image-to-diagram</w:t>
+      </w:r>
+      <w:r>
+        <w:t xml:space="preserve"> </w:t>
+      </w:r>
+      <w:r>
+        <w:t xml:space="preserve">path: attach a whiteboard photo, a screenshot, or a</w:t>
+      </w:r>
+      <w:r>
+        <w:t xml:space="preserve"> </w:t>
+      </w:r>
+      <w:r>
+        <w:rPr>
+          <w:i/>
+          <w:iCs/>
+        </w:rPr>
+        <w:t xml:space="preserve">competitor’s</w:t>
+      </w:r>
+      <w:r>
+        <w:t xml:space="preserve"> </w:t>
+      </w:r>
+      <w:r>
+        <w:t xml:space="preserve">flowchart and Claude’s vision + OCR reverse-engineer it into an editable diagram, even</w:t>
+      </w:r>
+      <w:r>
+        <w:t xml:space="preserve"> </w:t>
+      </w:r>
+      <w:r>
+        <w:rPr>
+          <w:b/>
+          <w:bCs/>
+        </w:rPr>
+        <w:t xml:space="preserve">translating a plain flowchart image into BPMN</w:t>
+      </w:r>
+      <w:r>
+        <w:t xml:space="preserve"> </w:t>
+      </w:r>
+      <w:r>
+        <w:t xml:space="preserve">(rectangle→task, decision diamond→gateway, …). Recent additions include first-class</w:t>
       </w:r>
       <w:r>
         <w:t xml:space="preserve"> </w:t>
@@ -2477,7 +2722,39 @@
         <w:t xml:space="preserve">layout of AI output is governed by an explicit, user-editable rule set</w:t>
       </w:r>
       <w:r>
-        <w:t xml:space="preserve">.</w:t>
+        <w:t xml:space="preserve"> </w:t>
+      </w:r>
+      <w:r>
+        <w:t xml:space="preserve">— and the only one that generates</w:t>
+      </w:r>
+      <w:r>
+        <w:t xml:space="preserve"> </w:t>
+      </w:r>
+      <w:r>
+        <w:rPr>
+          <w:b/>
+          <w:bCs/>
+        </w:rPr>
+        <w:t xml:space="preserve">all of its notations</w:t>
+      </w:r>
+      <w:r>
+        <w:t xml:space="preserve"> </w:t>
+      </w:r>
+      <w:r>
+        <w:t xml:space="preserve">from text (not just BPMN) and turns an</w:t>
+      </w:r>
+      <w:r>
+        <w:t xml:space="preserve"> </w:t>
+      </w:r>
+      <w:r>
+        <w:rPr>
+          <w:b/>
+          <w:bCs/>
+        </w:rPr>
+        <w:t xml:space="preserve">image / sketch into an editable diagram</w:t>
+      </w:r>
+      <w:r>
+        <w:t xml:space="preserve">, including flowchart→BPMN translation.</w:t>
       </w:r>
     </w:p>
     <w:p>
@@ -6993,7 +7270,39 @@
         <w:t xml:space="preserve"> </w:t>
       </w:r>
       <w:r>
-        <w:t xml:space="preserve">layout, then re-plan freely. The plan JSON is the source of truth.</w:t>
+        <w:t xml:space="preserve">layout, then re-plan freely (the plan JSON is the source of truth) — plus AI breadth no rival matches:</w:t>
+      </w:r>
+      <w:r>
+        <w:t xml:space="preserve"> </w:t>
+      </w:r>
+      <w:r>
+        <w:rPr>
+          <w:b/>
+          <w:bCs/>
+        </w:rPr>
+        <w:t xml:space="preserve">text → all 7 notations</w:t>
+      </w:r>
+      <w:r>
+        <w:t xml:space="preserve"> </w:t>
+      </w:r>
+      <w:r>
+        <w:t xml:space="preserve">(not just BPMN) and</w:t>
+      </w:r>
+      <w:r>
+        <w:t xml:space="preserve"> </w:t>
+      </w:r>
+      <w:r>
+        <w:rPr>
+          <w:b/>
+          <w:bCs/>
+        </w:rPr>
+        <w:t xml:space="preserve">image/sketch → editable BPMN</w:t>
+      </w:r>
+      <w:r>
+        <w:t xml:space="preserve"> </w:t>
+      </w:r>
+      <w:r>
+        <w:t xml:space="preserve">(including flowchart-photo → BPMN translation).</w:t>
       </w:r>
     </w:p>
     <w:p>

</xml_diff>